<commit_message>
ISAS:lab4 in progress.Odoo custom module configuration in progress
</commit_message>
<xml_diff>
--- a/ISAS/Reports/Report_4.docx
+++ b/ISAS/Reports/Report_4.docx
@@ -10,6 +10,8 @@
           <w:szCs w:val="28"/>
         </w:rPr>
       </w:pPr>
+      <w:bookmarkStart w:id="0" w:name="_Hlk224736532"/>
+      <w:bookmarkEnd w:id="0"/>
       <w:r>
         <w:rPr>
           <w:color w:val="000000"/>
@@ -628,6 +630,7 @@
       </w:pPr>
       <w:r>
         <w:rPr>
+          <w:noProof/>
           <w:sz w:val="28"/>
           <w:szCs w:val="28"/>
         </w:rPr>
@@ -636,177 +639,6 @@
             <wp:extent cx="6372225" cy="1019810"/>
             <wp:effectExtent l="0" t="0" r="9525" b="8890"/>
             <wp:docPr id="1" name="Рисунок 1"/>
-            <wp:cNvGraphicFramePr>
-              <a:graphicFrameLocks xmlns:a="http://schemas.openxmlformats.org/drawingml/2006/main" noChangeAspect="1"/>
-            </wp:cNvGraphicFramePr>
-            <a:graphic xmlns:a="http://schemas.openxmlformats.org/drawingml/2006/main">
-              <a:graphicData uri="http://schemas.openxmlformats.org/drawingml/2006/picture">
-                <pic:pic xmlns:pic="http://schemas.openxmlformats.org/drawingml/2006/picture">
-                  <pic:nvPicPr>
-                    <pic:cNvPr id="1" name=""/>
-                    <pic:cNvPicPr/>
-                  </pic:nvPicPr>
-                  <pic:blipFill>
-                    <a:blip r:embed="rId6"/>
-                    <a:stretch>
-                      <a:fillRect/>
-                    </a:stretch>
-                  </pic:blipFill>
-                  <pic:spPr>
-                    <a:xfrm>
-                      <a:off x="0" y="0"/>
-                      <a:ext cx="6372225" cy="1019810"/>
-                    </a:xfrm>
-                    <a:prstGeom prst="rect">
-                      <a:avLst/>
-                    </a:prstGeom>
-                  </pic:spPr>
-                </pic:pic>
-              </a:graphicData>
-            </a:graphic>
-          </wp:inline>
-        </w:drawing>
-      </w:r>
-    </w:p>
-    <w:p>
-      <w:pPr>
-        <w:jc w:val="center"/>
-        <w:rPr>
-          <w:sz w:val="28"/>
-          <w:szCs w:val="28"/>
-          <w:lang w:val="en-US"/>
-        </w:rPr>
-      </w:pPr>
-      <w:r>
-        <w:rPr>
-          <w:sz w:val="28"/>
-          <w:szCs w:val="28"/>
-        </w:rPr>
-        <w:t xml:space="preserve">Рисунок 1.1 – Результат установки пакета </w:t>
-      </w:r>
-      <w:r>
-        <w:rPr>
-          <w:sz w:val="28"/>
-          <w:szCs w:val="28"/>
-          <w:lang w:val="en-US"/>
-        </w:rPr>
-        <w:t>docker</w:t>
-      </w:r>
-      <w:r>
-        <w:rPr>
-          <w:sz w:val="28"/>
-          <w:szCs w:val="28"/>
-        </w:rPr>
-        <w:t>.</w:t>
-      </w:r>
-      <w:r>
-        <w:rPr>
-          <w:sz w:val="28"/>
-          <w:szCs w:val="28"/>
-          <w:lang w:val="en-US"/>
-        </w:rPr>
-        <w:t>io</w:t>
-      </w:r>
-    </w:p>
-    <w:p>
-      <w:pPr>
-        <w:spacing w:before="240"/>
-        <w:ind w:firstLine="708"/>
-        <w:jc w:val="both"/>
-        <w:rPr>
-          <w:sz w:val="28"/>
-          <w:szCs w:val="28"/>
-          <w:lang w:val="be-BY"/>
-        </w:rPr>
-      </w:pPr>
-      <w:r>
-        <w:rPr>
-          <w:sz w:val="28"/>
-          <w:szCs w:val="28"/>
-        </w:rPr>
-        <w:t xml:space="preserve">И для проверки работоспособности запустим тестовый контейнер с помощью </w:t>
-      </w:r>
-      <w:r>
-        <w:rPr>
-          <w:sz w:val="28"/>
-          <w:szCs w:val="28"/>
-          <w:lang w:val="en-US"/>
-        </w:rPr>
-        <w:t>docker</w:t>
-      </w:r>
-      <w:r>
-        <w:rPr>
-          <w:sz w:val="28"/>
-          <w:szCs w:val="28"/>
-        </w:rPr>
-        <w:t xml:space="preserve"> </w:t>
-      </w:r>
-      <w:r>
-        <w:rPr>
-          <w:sz w:val="28"/>
-          <w:szCs w:val="28"/>
-          <w:lang w:val="en-US"/>
-        </w:rPr>
-        <w:t>run</w:t>
-      </w:r>
-      <w:r>
-        <w:rPr>
-          <w:sz w:val="28"/>
-          <w:szCs w:val="28"/>
-        </w:rPr>
-        <w:t xml:space="preserve"> </w:t>
-      </w:r>
-      <w:r>
-        <w:rPr>
-          <w:sz w:val="28"/>
-          <w:szCs w:val="28"/>
-          <w:lang w:val="en-US"/>
-        </w:rPr>
-        <w:t>hello</w:t>
-      </w:r>
-      <w:r>
-        <w:rPr>
-          <w:sz w:val="28"/>
-          <w:szCs w:val="28"/>
-        </w:rPr>
-        <w:t>-</w:t>
-      </w:r>
-      <w:r>
-        <w:rPr>
-          <w:sz w:val="28"/>
-          <w:szCs w:val="28"/>
-          <w:lang w:val="en-US"/>
-        </w:rPr>
-        <w:t>world</w:t>
-      </w:r>
-      <w:r>
-        <w:rPr>
-          <w:sz w:val="28"/>
-          <w:szCs w:val="28"/>
-          <w:lang w:val="be-BY"/>
-        </w:rPr>
-        <w:t>. Результат представлен на рисунке 1.2.</w:t>
-      </w:r>
-    </w:p>
-    <w:p>
-      <w:pPr>
-        <w:spacing w:before="240" w:after="120"/>
-        <w:jc w:val="center"/>
-        <w:rPr>
-          <w:sz w:val="28"/>
-          <w:szCs w:val="28"/>
-        </w:rPr>
-      </w:pPr>
-      <w:r>
-        <w:rPr>
-          <w:sz w:val="28"/>
-          <w:szCs w:val="28"/>
-        </w:rPr>
-        <w:drawing>
-          <wp:inline distT="0" distB="0" distL="0" distR="0" wp14:anchorId="72DE86D8" wp14:editId="596ABCD0">
-            <wp:extent cx="4732020" cy="2734528"/>
-            <wp:effectExtent l="0" t="0" r="0" b="8890"/>
-            <wp:docPr id="2" name="Рисунок 2"/>
             <wp:cNvGraphicFramePr>
               <a:graphicFrameLocks xmlns:a="http://schemas.openxmlformats.org/drawingml/2006/main" noChangeAspect="1"/>
             </wp:cNvGraphicFramePr>
@@ -826,7 +658,7 @@
                   <pic:spPr>
                     <a:xfrm>
                       <a:off x="0" y="0"/>
-                      <a:ext cx="4736630" cy="2737192"/>
+                      <a:ext cx="6372225" cy="1019810"/>
                     </a:xfrm>
                     <a:prstGeom prst="rect">
                       <a:avLst/>
@@ -852,7 +684,30 @@
           <w:sz w:val="28"/>
           <w:szCs w:val="28"/>
         </w:rPr>
-        <w:t>Рисунок 1.2. – Результат запуска тестового контейнера</w:t>
+        <w:t xml:space="preserve">Рисунок 1.1 – Результат установки пакета </w:t>
+      </w:r>
+      <w:r>
+        <w:rPr>
+          <w:sz w:val="28"/>
+          <w:szCs w:val="28"/>
+          <w:lang w:val="en-US"/>
+        </w:rPr>
+        <w:t>docker</w:t>
+      </w:r>
+      <w:r>
+        <w:rPr>
+          <w:sz w:val="28"/>
+          <w:szCs w:val="28"/>
+        </w:rPr>
+        <w:t>.</w:t>
+      </w:r>
+      <w:r>
+        <w:rPr>
+          <w:sz w:val="28"/>
+          <w:szCs w:val="28"/>
+          <w:lang w:val="en-US"/>
+        </w:rPr>
+        <w:t>io</w:t>
       </w:r>
     </w:p>
     <w:p>
@@ -863,60 +718,15 @@
         <w:rPr>
           <w:sz w:val="28"/>
           <w:szCs w:val="28"/>
-        </w:rPr>
-      </w:pPr>
-      <w:r>
-        <w:rPr>
-          <w:sz w:val="28"/>
-          <w:szCs w:val="28"/>
-        </w:rPr>
-        <w:t xml:space="preserve">Далее </w:t>
-      </w:r>
-      <w:r>
-        <w:rPr>
-          <w:sz w:val="28"/>
-          <w:szCs w:val="28"/>
-        </w:rPr>
-        <w:t xml:space="preserve">необходимо </w:t>
-      </w:r>
-      <w:r>
-        <w:rPr>
-          <w:sz w:val="28"/>
-          <w:szCs w:val="28"/>
-        </w:rPr>
-        <w:t xml:space="preserve">выполнить установку </w:t>
-      </w:r>
-      <w:r>
-        <w:rPr>
-          <w:sz w:val="28"/>
-          <w:szCs w:val="28"/>
-          <w:lang w:val="en-US"/>
-        </w:rPr>
-        <w:t>ERP</w:t>
-      </w:r>
-      <w:r>
-        <w:rPr>
-          <w:sz w:val="28"/>
-          <w:szCs w:val="28"/>
-        </w:rPr>
-        <w:t xml:space="preserve">-системы </w:t>
-      </w:r>
-      <w:proofErr w:type="spellStart"/>
-      <w:r>
-        <w:rPr>
-          <w:sz w:val="28"/>
-          <w:szCs w:val="28"/>
-          <w:lang w:val="en-US"/>
-        </w:rPr>
-        <w:t>odoo</w:t>
-      </w:r>
-      <w:proofErr w:type="spellEnd"/>
-      <w:r>
-        <w:rPr>
-          <w:sz w:val="28"/>
-          <w:szCs w:val="28"/>
-        </w:rPr>
-        <w:t xml:space="preserve"> с помощью </w:t>
+          <w:lang w:val="be-BY"/>
+        </w:rPr>
+      </w:pPr>
+      <w:r>
+        <w:rPr>
+          <w:sz w:val="28"/>
+          <w:szCs w:val="28"/>
+        </w:rPr>
+        <w:t xml:space="preserve">И для проверки работоспособности запустим тестовый контейнер с помощью </w:t>
       </w:r>
       <w:r>
         <w:rPr>
@@ -931,139 +741,53 @@
           <w:sz w:val="28"/>
           <w:szCs w:val="28"/>
         </w:rPr>
-        <w:t xml:space="preserve"> и инструкций на сайте hub.docker.com</w:t>
-      </w:r>
-      <w:r>
-        <w:rPr>
-          <w:sz w:val="28"/>
-          <w:szCs w:val="28"/>
-        </w:rPr>
-        <w:t xml:space="preserve">. </w:t>
-      </w:r>
-      <w:r>
-        <w:rPr>
-          <w:sz w:val="28"/>
-          <w:szCs w:val="28"/>
-        </w:rPr>
-        <w:t xml:space="preserve">Для установки </w:t>
-      </w:r>
-      <w:proofErr w:type="spellStart"/>
-      <w:r>
-        <w:rPr>
-          <w:sz w:val="28"/>
-          <w:szCs w:val="28"/>
-        </w:rPr>
-        <w:t>Odoo</w:t>
-      </w:r>
-      <w:proofErr w:type="spellEnd"/>
-      <w:r>
-        <w:rPr>
-          <w:sz w:val="28"/>
-          <w:szCs w:val="28"/>
-        </w:rPr>
-        <w:t xml:space="preserve"> через </w:t>
-      </w:r>
-      <w:proofErr w:type="spellStart"/>
-      <w:r>
-        <w:rPr>
-          <w:sz w:val="28"/>
-          <w:szCs w:val="28"/>
-        </w:rPr>
-        <w:t>Docker</w:t>
-      </w:r>
-      <w:proofErr w:type="spellEnd"/>
-      <w:r>
-        <w:rPr>
-          <w:sz w:val="28"/>
-          <w:szCs w:val="28"/>
-        </w:rPr>
-        <w:t xml:space="preserve"> согласно официальным инструкциям с </w:t>
-      </w:r>
-      <w:proofErr w:type="spellStart"/>
-      <w:r>
-        <w:rPr>
-          <w:sz w:val="28"/>
-          <w:szCs w:val="28"/>
-        </w:rPr>
-        <w:t>Docker</w:t>
-      </w:r>
-      <w:proofErr w:type="spellEnd"/>
-      <w:r>
-        <w:rPr>
-          <w:sz w:val="28"/>
-          <w:szCs w:val="28"/>
-        </w:rPr>
         <w:t xml:space="preserve"> </w:t>
       </w:r>
-      <w:proofErr w:type="spellStart"/>
-      <w:r>
-        <w:rPr>
-          <w:sz w:val="28"/>
-          <w:szCs w:val="28"/>
-        </w:rPr>
-        <w:t>Hub</w:t>
-      </w:r>
-      <w:proofErr w:type="spellEnd"/>
-      <w:r>
-        <w:rPr>
-          <w:sz w:val="28"/>
-          <w:szCs w:val="28"/>
-        </w:rPr>
-        <w:t xml:space="preserve">, нам потребуется запустить два контейнера: один для базы данных </w:t>
-      </w:r>
-      <w:proofErr w:type="spellStart"/>
-      <w:r>
-        <w:rPr>
-          <w:sz w:val="28"/>
-          <w:szCs w:val="28"/>
-        </w:rPr>
-        <w:t>PostgreSQL</w:t>
-      </w:r>
-      <w:proofErr w:type="spellEnd"/>
-      <w:r>
-        <w:rPr>
-          <w:sz w:val="28"/>
-          <w:szCs w:val="28"/>
-        </w:rPr>
-        <w:t xml:space="preserve">, а второй для самого приложения </w:t>
-      </w:r>
-      <w:proofErr w:type="spellStart"/>
-      <w:r>
-        <w:rPr>
-          <w:sz w:val="28"/>
-          <w:szCs w:val="28"/>
-        </w:rPr>
-        <w:t>Odoo</w:t>
-      </w:r>
-      <w:proofErr w:type="spellEnd"/>
-      <w:r>
-        <w:rPr>
-          <w:sz w:val="28"/>
-          <w:szCs w:val="28"/>
-        </w:rPr>
-        <w:t>.</w:t>
-      </w:r>
-      <w:r>
-        <w:rPr>
-          <w:sz w:val="28"/>
-          <w:szCs w:val="28"/>
-        </w:rPr>
-        <w:t xml:space="preserve"> Результат запуска контейнера </w:t>
-      </w:r>
-      <w:r>
-        <w:rPr>
-          <w:sz w:val="28"/>
-          <w:szCs w:val="28"/>
-          <w:lang w:val="en-US"/>
-        </w:rPr>
-        <w:t xml:space="preserve">PostgreSQL </w:t>
-      </w:r>
-      <w:r>
-        <w:rPr>
-          <w:sz w:val="28"/>
-          <w:szCs w:val="28"/>
-        </w:rPr>
-        <w:t>представлен на рисунке 1.3.</w:t>
+      <w:r>
+        <w:rPr>
+          <w:sz w:val="28"/>
+          <w:szCs w:val="28"/>
+          <w:lang w:val="en-US"/>
+        </w:rPr>
+        <w:t>run</w:t>
+      </w:r>
+      <w:r>
+        <w:rPr>
+          <w:sz w:val="28"/>
+          <w:szCs w:val="28"/>
+        </w:rPr>
+        <w:t xml:space="preserve"> </w:t>
+      </w:r>
+      <w:r>
+        <w:rPr>
+          <w:sz w:val="28"/>
+          <w:szCs w:val="28"/>
+          <w:lang w:val="en-US"/>
+        </w:rPr>
+        <w:t>hello</w:t>
+      </w:r>
+      <w:r>
+        <w:rPr>
+          <w:sz w:val="28"/>
+          <w:szCs w:val="28"/>
+        </w:rPr>
+        <w:t>-</w:t>
+      </w:r>
+      <w:r>
+        <w:rPr>
+          <w:sz w:val="28"/>
+          <w:szCs w:val="28"/>
+          <w:lang w:val="en-US"/>
+        </w:rPr>
+        <w:t>world</w:t>
+      </w:r>
+      <w:r>
+        <w:rPr>
+          <w:sz w:val="28"/>
+          <w:szCs w:val="28"/>
+          <w:lang w:val="be-BY"/>
+        </w:rPr>
+        <w:t>. Результат представлен на рисунке 1.2.</w:t>
       </w:r>
     </w:p>
     <w:p>
@@ -1077,14 +801,15 @@
       </w:pPr>
       <w:r>
         <w:rPr>
+          <w:noProof/>
           <w:sz w:val="28"/>
           <w:szCs w:val="28"/>
         </w:rPr>
         <w:drawing>
-          <wp:inline distT="0" distB="0" distL="0" distR="0" wp14:anchorId="35AD3BFE" wp14:editId="056D8392">
-            <wp:extent cx="5234940" cy="1763238"/>
-            <wp:effectExtent l="0" t="0" r="3810" b="8890"/>
-            <wp:docPr id="3" name="Рисунок 3"/>
+          <wp:inline distT="0" distB="0" distL="0" distR="0" wp14:anchorId="72DE86D8" wp14:editId="596ABCD0">
+            <wp:extent cx="4732020" cy="2734528"/>
+            <wp:effectExtent l="0" t="0" r="0" b="8890"/>
+            <wp:docPr id="2" name="Рисунок 2"/>
             <wp:cNvGraphicFramePr>
               <a:graphicFrameLocks xmlns:a="http://schemas.openxmlformats.org/drawingml/2006/main" noChangeAspect="1"/>
             </wp:cNvGraphicFramePr>
@@ -1104,7 +829,7 @@
                   <pic:spPr>
                     <a:xfrm>
                       <a:off x="0" y="0"/>
-                      <a:ext cx="5243234" cy="1766032"/>
+                      <a:ext cx="4736630" cy="2737192"/>
                     </a:xfrm>
                     <a:prstGeom prst="rect">
                       <a:avLst/>
@@ -1123,34 +848,19 @@
         <w:rPr>
           <w:sz w:val="28"/>
           <w:szCs w:val="28"/>
-          <w:lang w:val="en-US"/>
-        </w:rPr>
-      </w:pPr>
-      <w:r>
-        <w:rPr>
-          <w:sz w:val="28"/>
-          <w:szCs w:val="28"/>
-        </w:rPr>
-        <w:t xml:space="preserve">Рисунок 1.3 – Результат установки </w:t>
-      </w:r>
-      <w:r>
-        <w:rPr>
-          <w:sz w:val="28"/>
-          <w:szCs w:val="28"/>
-        </w:rPr>
-        <w:t xml:space="preserve">контейнера </w:t>
-      </w:r>
-      <w:r>
-        <w:rPr>
-          <w:sz w:val="28"/>
-          <w:szCs w:val="28"/>
-          <w:lang w:val="en-US"/>
-        </w:rPr>
-        <w:t>PostgreSQL</w:t>
-      </w:r>
-    </w:p>
-    <w:p>
-      <w:pPr>
+        </w:rPr>
+      </w:pPr>
+      <w:r>
+        <w:rPr>
+          <w:sz w:val="28"/>
+          <w:szCs w:val="28"/>
+        </w:rPr>
+        <w:t>Рисунок 1.2. – Результат запуска тестового контейнера</w:t>
+      </w:r>
+    </w:p>
+    <w:p>
+      <w:pPr>
+        <w:spacing w:before="240"/>
         <w:ind w:firstLine="708"/>
         <w:jc w:val="both"/>
         <w:rPr>
@@ -1163,8 +873,29 @@
           <w:sz w:val="28"/>
           <w:szCs w:val="28"/>
         </w:rPr>
-        <w:lastRenderedPageBreak/>
-        <w:t xml:space="preserve">Теперь установим контейнер с системой </w:t>
+        <w:t xml:space="preserve">Далее </w:t>
+      </w:r>
+      <w:r>
+        <w:rPr>
+          <w:sz w:val="28"/>
+          <w:szCs w:val="28"/>
+        </w:rPr>
+        <w:t xml:space="preserve">необходимо выполнить установку </w:t>
+      </w:r>
+      <w:r>
+        <w:rPr>
+          <w:sz w:val="28"/>
+          <w:szCs w:val="28"/>
+          <w:lang w:val="en-US"/>
+        </w:rPr>
+        <w:t>ERP</w:t>
+      </w:r>
+      <w:r>
+        <w:rPr>
+          <w:sz w:val="28"/>
+          <w:szCs w:val="28"/>
+        </w:rPr>
+        <w:t xml:space="preserve">-системы </w:t>
       </w:r>
       <w:proofErr w:type="spellStart"/>
       <w:r>
@@ -1181,38 +912,124 @@
           <w:sz w:val="28"/>
           <w:szCs w:val="28"/>
         </w:rPr>
+        <w:t xml:space="preserve"> с помощью </w:t>
+      </w:r>
+      <w:r>
+        <w:rPr>
+          <w:sz w:val="28"/>
+          <w:szCs w:val="28"/>
+          <w:lang w:val="en-US"/>
+        </w:rPr>
+        <w:t>docker</w:t>
+      </w:r>
+      <w:r>
+        <w:rPr>
+          <w:sz w:val="28"/>
+          <w:szCs w:val="28"/>
+        </w:rPr>
+        <w:t xml:space="preserve"> и инструкций на сайте hub.docker.com</w:t>
+      </w:r>
+      <w:r>
+        <w:rPr>
+          <w:sz w:val="28"/>
+          <w:szCs w:val="28"/>
+        </w:rPr>
+        <w:t xml:space="preserve">. </w:t>
+      </w:r>
+      <w:r>
+        <w:rPr>
+          <w:sz w:val="28"/>
+          <w:szCs w:val="28"/>
+        </w:rPr>
+        <w:t xml:space="preserve">Для установки </w:t>
+      </w:r>
+      <w:proofErr w:type="spellStart"/>
+      <w:r>
+        <w:rPr>
+          <w:sz w:val="28"/>
+          <w:szCs w:val="28"/>
+        </w:rPr>
+        <w:t>Odoo</w:t>
+      </w:r>
+      <w:proofErr w:type="spellEnd"/>
+      <w:r>
+        <w:rPr>
+          <w:sz w:val="28"/>
+          <w:szCs w:val="28"/>
+        </w:rPr>
+        <w:t xml:space="preserve"> через </w:t>
+      </w:r>
+      <w:proofErr w:type="spellStart"/>
+      <w:r>
+        <w:rPr>
+          <w:sz w:val="28"/>
+          <w:szCs w:val="28"/>
+        </w:rPr>
+        <w:t>Docker</w:t>
+      </w:r>
+      <w:proofErr w:type="spellEnd"/>
+      <w:r>
+        <w:rPr>
+          <w:sz w:val="28"/>
+          <w:szCs w:val="28"/>
+        </w:rPr>
+        <w:t xml:space="preserve"> согласно официальным инструкциям с </w:t>
+      </w:r>
+      <w:proofErr w:type="spellStart"/>
+      <w:r>
+        <w:rPr>
+          <w:sz w:val="28"/>
+          <w:szCs w:val="28"/>
+        </w:rPr>
+        <w:t>Docker</w:t>
+      </w:r>
+      <w:proofErr w:type="spellEnd"/>
+      <w:r>
+        <w:rPr>
+          <w:sz w:val="28"/>
+          <w:szCs w:val="28"/>
+        </w:rPr>
         <w:t xml:space="preserve"> </w:t>
       </w:r>
-      <w:r>
-        <w:rPr>
-          <w:sz w:val="28"/>
-          <w:szCs w:val="28"/>
-        </w:rPr>
-        <w:t xml:space="preserve">и свяжем его с ранее созданным контейнером </w:t>
-      </w:r>
-      <w:r>
-        <w:rPr>
-          <w:sz w:val="28"/>
-          <w:szCs w:val="28"/>
-          <w:lang w:val="en-US"/>
+      <w:proofErr w:type="spellStart"/>
+      <w:r>
+        <w:rPr>
+          <w:sz w:val="28"/>
+          <w:szCs w:val="28"/>
+        </w:rPr>
+        <w:t>Hub</w:t>
+      </w:r>
+      <w:proofErr w:type="spellEnd"/>
+      <w:r>
+        <w:rPr>
+          <w:sz w:val="28"/>
+          <w:szCs w:val="28"/>
+        </w:rPr>
+        <w:t xml:space="preserve">, нам потребуется запустить два контейнера: один для базы данных </w:t>
+      </w:r>
+      <w:proofErr w:type="spellStart"/>
+      <w:r>
+        <w:rPr>
+          <w:sz w:val="28"/>
+          <w:szCs w:val="28"/>
         </w:rPr>
         <w:t>PostgreSQL</w:t>
       </w:r>
-      <w:r>
-        <w:rPr>
-          <w:sz w:val="28"/>
-          <w:szCs w:val="28"/>
-        </w:rPr>
-        <w:t xml:space="preserve">. Так как </w:t>
+      <w:proofErr w:type="spellEnd"/>
+      <w:r>
+        <w:rPr>
+          <w:sz w:val="28"/>
+          <w:szCs w:val="28"/>
+        </w:rPr>
+        <w:t xml:space="preserve">, а второй для самого приложения </w:t>
       </w:r>
       <w:proofErr w:type="spellStart"/>
       <w:r>
         <w:rPr>
           <w:sz w:val="28"/>
           <w:szCs w:val="28"/>
-          <w:lang w:val="en-US"/>
-        </w:rPr>
-        <w:t>odoo</w:t>
+        </w:rPr>
+        <w:t>Odoo</w:t>
       </w:r>
       <w:proofErr w:type="spellEnd"/>
       <w:r>
@@ -1220,68 +1037,29 @@
           <w:sz w:val="28"/>
           <w:szCs w:val="28"/>
         </w:rPr>
-        <w:t xml:space="preserve"> </w:t>
-      </w:r>
-      <w:r>
-        <w:rPr>
-          <w:sz w:val="28"/>
-          <w:szCs w:val="28"/>
-        </w:rPr>
-        <w:t xml:space="preserve">автоматически ищет базу данных с названием </w:t>
-      </w:r>
-      <w:proofErr w:type="spellStart"/>
-      <w:r>
-        <w:rPr>
-          <w:sz w:val="28"/>
-          <w:szCs w:val="28"/>
-          <w:lang w:val="en-US"/>
-        </w:rPr>
-        <w:t>db</w:t>
-      </w:r>
-      <w:proofErr w:type="spellEnd"/>
-      <w:r>
-        <w:rPr>
-          <w:sz w:val="28"/>
-          <w:szCs w:val="28"/>
-        </w:rPr>
-        <w:t xml:space="preserve"> </w:t>
-      </w:r>
-      <w:r>
-        <w:rPr>
-          <w:sz w:val="28"/>
-          <w:szCs w:val="28"/>
-        </w:rPr>
-        <w:t>–</w:t>
-      </w:r>
-      <w:r>
-        <w:rPr>
-          <w:sz w:val="28"/>
-          <w:szCs w:val="28"/>
-        </w:rPr>
-        <w:t xml:space="preserve"> </w:t>
-      </w:r>
-      <w:r>
-        <w:rPr>
-          <w:sz w:val="28"/>
-          <w:szCs w:val="28"/>
-        </w:rPr>
-        <w:t xml:space="preserve">в контейнере </w:t>
-      </w:r>
-      <w:proofErr w:type="gramStart"/>
-      <w:r>
-        <w:rPr>
-          <w:sz w:val="28"/>
-          <w:szCs w:val="28"/>
-        </w:rPr>
-        <w:t>она</w:t>
-      </w:r>
-      <w:proofErr w:type="gramEnd"/>
-      <w:r>
-        <w:rPr>
-          <w:sz w:val="28"/>
-          <w:szCs w:val="28"/>
-        </w:rPr>
-        <w:t xml:space="preserve"> так и названа. Результат установки представлен на рисунке 1.4.</w:t>
+        <w:t>.</w:t>
+      </w:r>
+      <w:r>
+        <w:rPr>
+          <w:sz w:val="28"/>
+          <w:szCs w:val="28"/>
+        </w:rPr>
+        <w:t xml:space="preserve"> Результат запуска контейнера </w:t>
+      </w:r>
+      <w:r>
+        <w:rPr>
+          <w:sz w:val="28"/>
+          <w:szCs w:val="28"/>
+          <w:lang w:val="en-US"/>
+        </w:rPr>
+        <w:t xml:space="preserve">PostgreSQL </w:t>
+      </w:r>
+      <w:r>
+        <w:rPr>
+          <w:sz w:val="28"/>
+          <w:szCs w:val="28"/>
+        </w:rPr>
+        <w:t>представлен на рисунке 1.3.</w:t>
       </w:r>
     </w:p>
     <w:p>
@@ -1291,20 +1069,19 @@
         <w:rPr>
           <w:sz w:val="28"/>
           <w:szCs w:val="28"/>
-          <w:lang w:val="en-US"/>
-        </w:rPr>
-      </w:pPr>
-      <w:r>
-        <w:rPr>
-          <w:sz w:val="28"/>
-          <w:szCs w:val="28"/>
-          <w:lang w:val="en-US"/>
+        </w:rPr>
+      </w:pPr>
+      <w:r>
+        <w:rPr>
+          <w:noProof/>
+          <w:sz w:val="28"/>
+          <w:szCs w:val="28"/>
         </w:rPr>
         <w:drawing>
-          <wp:inline distT="0" distB="0" distL="0" distR="0" wp14:anchorId="3D4002CA" wp14:editId="6E8F111A">
-            <wp:extent cx="6372225" cy="1520825"/>
-            <wp:effectExtent l="0" t="0" r="9525" b="3175"/>
-            <wp:docPr id="4" name="Рисунок 4"/>
+          <wp:inline distT="0" distB="0" distL="0" distR="0" wp14:anchorId="35AD3BFE" wp14:editId="056D8392">
+            <wp:extent cx="5234940" cy="1763238"/>
+            <wp:effectExtent l="0" t="0" r="3810" b="8890"/>
+            <wp:docPr id="3" name="Рисунок 3"/>
             <wp:cNvGraphicFramePr>
               <a:graphicFrameLocks xmlns:a="http://schemas.openxmlformats.org/drawingml/2006/main" noChangeAspect="1"/>
             </wp:cNvGraphicFramePr>
@@ -1324,6 +1101,227 @@
                   <pic:spPr>
                     <a:xfrm>
                       <a:off x="0" y="0"/>
+                      <a:ext cx="5243234" cy="1766032"/>
+                    </a:xfrm>
+                    <a:prstGeom prst="rect">
+                      <a:avLst/>
+                    </a:prstGeom>
+                  </pic:spPr>
+                </pic:pic>
+              </a:graphicData>
+            </a:graphic>
+          </wp:inline>
+        </w:drawing>
+      </w:r>
+    </w:p>
+    <w:p>
+      <w:pPr>
+        <w:jc w:val="center"/>
+        <w:rPr>
+          <w:sz w:val="28"/>
+          <w:szCs w:val="28"/>
+          <w:lang w:val="en-US"/>
+        </w:rPr>
+      </w:pPr>
+      <w:r>
+        <w:rPr>
+          <w:sz w:val="28"/>
+          <w:szCs w:val="28"/>
+        </w:rPr>
+        <w:t xml:space="preserve">Рисунок 1.3 – Результат установки </w:t>
+      </w:r>
+      <w:r>
+        <w:rPr>
+          <w:sz w:val="28"/>
+          <w:szCs w:val="28"/>
+        </w:rPr>
+        <w:t xml:space="preserve">контейнера </w:t>
+      </w:r>
+      <w:r>
+        <w:rPr>
+          <w:sz w:val="28"/>
+          <w:szCs w:val="28"/>
+          <w:lang w:val="en-US"/>
+        </w:rPr>
+        <w:t>PostgreSQL</w:t>
+      </w:r>
+    </w:p>
+    <w:p>
+      <w:pPr>
+        <w:ind w:firstLine="708"/>
+        <w:jc w:val="both"/>
+        <w:rPr>
+          <w:sz w:val="28"/>
+          <w:szCs w:val="28"/>
+        </w:rPr>
+      </w:pPr>
+      <w:r>
+        <w:rPr>
+          <w:sz w:val="28"/>
+          <w:szCs w:val="28"/>
+        </w:rPr>
+        <w:lastRenderedPageBreak/>
+        <w:t xml:space="preserve">Теперь установим контейнер с системой </w:t>
+      </w:r>
+      <w:proofErr w:type="spellStart"/>
+      <w:r>
+        <w:rPr>
+          <w:sz w:val="28"/>
+          <w:szCs w:val="28"/>
+          <w:lang w:val="en-US"/>
+        </w:rPr>
+        <w:t>odoo</w:t>
+      </w:r>
+      <w:proofErr w:type="spellEnd"/>
+      <w:r>
+        <w:rPr>
+          <w:sz w:val="28"/>
+          <w:szCs w:val="28"/>
+        </w:rPr>
+        <w:t xml:space="preserve"> </w:t>
+      </w:r>
+      <w:r>
+        <w:rPr>
+          <w:sz w:val="28"/>
+          <w:szCs w:val="28"/>
+        </w:rPr>
+        <w:t xml:space="preserve">и свяжем его с ранее созданным контейнером </w:t>
+      </w:r>
+      <w:r>
+        <w:rPr>
+          <w:sz w:val="28"/>
+          <w:szCs w:val="28"/>
+          <w:lang w:val="en-US"/>
+        </w:rPr>
+        <w:t>PostgreSQL</w:t>
+      </w:r>
+      <w:r>
+        <w:rPr>
+          <w:sz w:val="28"/>
+          <w:szCs w:val="28"/>
+        </w:rPr>
+        <w:t xml:space="preserve">. Так как </w:t>
+      </w:r>
+      <w:proofErr w:type="spellStart"/>
+      <w:r>
+        <w:rPr>
+          <w:sz w:val="28"/>
+          <w:szCs w:val="28"/>
+          <w:lang w:val="en-US"/>
+        </w:rPr>
+        <w:t>odoo</w:t>
+      </w:r>
+      <w:proofErr w:type="spellEnd"/>
+      <w:r>
+        <w:rPr>
+          <w:sz w:val="28"/>
+          <w:szCs w:val="28"/>
+        </w:rPr>
+        <w:t xml:space="preserve"> </w:t>
+      </w:r>
+      <w:r>
+        <w:rPr>
+          <w:sz w:val="28"/>
+          <w:szCs w:val="28"/>
+        </w:rPr>
+        <w:t xml:space="preserve">автоматически ищет базу данных с названием </w:t>
+      </w:r>
+      <w:proofErr w:type="spellStart"/>
+      <w:r>
+        <w:rPr>
+          <w:sz w:val="28"/>
+          <w:szCs w:val="28"/>
+          <w:lang w:val="en-US"/>
+        </w:rPr>
+        <w:t>db</w:t>
+      </w:r>
+      <w:proofErr w:type="spellEnd"/>
+      <w:r>
+        <w:rPr>
+          <w:sz w:val="28"/>
+          <w:szCs w:val="28"/>
+        </w:rPr>
+        <w:t xml:space="preserve"> </w:t>
+      </w:r>
+      <w:r>
+        <w:rPr>
+          <w:sz w:val="28"/>
+          <w:szCs w:val="28"/>
+        </w:rPr>
+        <w:t>–</w:t>
+      </w:r>
+      <w:r>
+        <w:rPr>
+          <w:sz w:val="28"/>
+          <w:szCs w:val="28"/>
+        </w:rPr>
+        <w:t xml:space="preserve"> </w:t>
+      </w:r>
+      <w:r>
+        <w:rPr>
+          <w:sz w:val="28"/>
+          <w:szCs w:val="28"/>
+        </w:rPr>
+        <w:t xml:space="preserve">в контейнере </w:t>
+      </w:r>
+      <w:proofErr w:type="gramStart"/>
+      <w:r>
+        <w:rPr>
+          <w:sz w:val="28"/>
+          <w:szCs w:val="28"/>
+        </w:rPr>
+        <w:t>она</w:t>
+      </w:r>
+      <w:proofErr w:type="gramEnd"/>
+      <w:r>
+        <w:rPr>
+          <w:sz w:val="28"/>
+          <w:szCs w:val="28"/>
+        </w:rPr>
+        <w:t xml:space="preserve"> так и названа. Результат установки представлен на рисунке 1.4.</w:t>
+      </w:r>
+    </w:p>
+    <w:p>
+      <w:pPr>
+        <w:spacing w:before="240" w:after="120"/>
+        <w:jc w:val="center"/>
+        <w:rPr>
+          <w:sz w:val="28"/>
+          <w:szCs w:val="28"/>
+          <w:lang w:val="en-US"/>
+        </w:rPr>
+      </w:pPr>
+      <w:r>
+        <w:rPr>
+          <w:noProof/>
+          <w:sz w:val="28"/>
+          <w:szCs w:val="28"/>
+          <w:lang w:val="en-US"/>
+        </w:rPr>
+        <w:drawing>
+          <wp:inline distT="0" distB="0" distL="0" distR="0" wp14:anchorId="3D4002CA" wp14:editId="6E8F111A">
+            <wp:extent cx="6372225" cy="1520825"/>
+            <wp:effectExtent l="0" t="0" r="9525" b="3175"/>
+            <wp:docPr id="4" name="Рисунок 4"/>
+            <wp:cNvGraphicFramePr>
+              <a:graphicFrameLocks xmlns:a="http://schemas.openxmlformats.org/drawingml/2006/main" noChangeAspect="1"/>
+            </wp:cNvGraphicFramePr>
+            <a:graphic xmlns:a="http://schemas.openxmlformats.org/drawingml/2006/main">
+              <a:graphicData uri="http://schemas.openxmlformats.org/drawingml/2006/picture">
+                <pic:pic xmlns:pic="http://schemas.openxmlformats.org/drawingml/2006/picture">
+                  <pic:nvPicPr>
+                    <pic:cNvPr id="1" name=""/>
+                    <pic:cNvPicPr/>
+                  </pic:nvPicPr>
+                  <pic:blipFill>
+                    <a:blip r:embed="rId10"/>
+                    <a:stretch>
+                      <a:fillRect/>
+                    </a:stretch>
+                  </pic:blipFill>
+                  <pic:spPr>
+                    <a:xfrm>
+                      <a:off x="0" y="0"/>
                       <a:ext cx="6372225" cy="1520825"/>
                     </a:xfrm>
                     <a:prstGeom prst="rect">
@@ -1343,7 +1341,6 @@
         <w:rPr>
           <w:sz w:val="28"/>
           <w:szCs w:val="28"/>
-          <w:lang w:val="en-US"/>
         </w:rPr>
       </w:pPr>
       <w:r>
@@ -1505,6 +1502,7 @@
       </w:pPr>
       <w:r>
         <w:rPr>
+          <w:noProof/>
           <w:sz w:val="28"/>
           <w:szCs w:val="28"/>
         </w:rPr>
@@ -1513,140 +1511,6 @@
             <wp:extent cx="4663440" cy="3779083"/>
             <wp:effectExtent l="0" t="0" r="3810" b="0"/>
             <wp:docPr id="5" name="Рисунок 5"/>
-            <wp:cNvGraphicFramePr>
-              <a:graphicFrameLocks xmlns:a="http://schemas.openxmlformats.org/drawingml/2006/main" noChangeAspect="1"/>
-            </wp:cNvGraphicFramePr>
-            <a:graphic xmlns:a="http://schemas.openxmlformats.org/drawingml/2006/main">
-              <a:graphicData uri="http://schemas.openxmlformats.org/drawingml/2006/picture">
-                <pic:pic xmlns:pic="http://schemas.openxmlformats.org/drawingml/2006/picture">
-                  <pic:nvPicPr>
-                    <pic:cNvPr id="1" name=""/>
-                    <pic:cNvPicPr/>
-                  </pic:nvPicPr>
-                  <pic:blipFill>
-                    <a:blip r:embed="rId10"/>
-                    <a:stretch>
-                      <a:fillRect/>
-                    </a:stretch>
-                  </pic:blipFill>
-                  <pic:spPr>
-                    <a:xfrm>
-                      <a:off x="0" y="0"/>
-                      <a:ext cx="4670415" cy="3784735"/>
-                    </a:xfrm>
-                    <a:prstGeom prst="rect">
-                      <a:avLst/>
-                    </a:prstGeom>
-                  </pic:spPr>
-                </pic:pic>
-              </a:graphicData>
-            </a:graphic>
-          </wp:inline>
-        </w:drawing>
-      </w:r>
-    </w:p>
-    <w:p>
-      <w:pPr>
-        <w:jc w:val="center"/>
-        <w:rPr>
-          <w:sz w:val="28"/>
-          <w:szCs w:val="28"/>
-          <w:lang w:val="en-US"/>
-        </w:rPr>
-      </w:pPr>
-      <w:r>
-        <w:rPr>
-          <w:sz w:val="28"/>
-          <w:szCs w:val="28"/>
-        </w:rPr>
-        <w:t xml:space="preserve">Рисунок 1.5 – Регистрации в </w:t>
-      </w:r>
-      <w:proofErr w:type="spellStart"/>
-      <w:r>
-        <w:rPr>
-          <w:sz w:val="28"/>
-          <w:szCs w:val="28"/>
-          <w:lang w:val="en-US"/>
-        </w:rPr>
-        <w:t>odoo</w:t>
-      </w:r>
-      <w:proofErr w:type="spellEnd"/>
-    </w:p>
-    <w:p>
-      <w:pPr>
-        <w:spacing w:before="240"/>
-        <w:ind w:firstLine="708"/>
-        <w:jc w:val="both"/>
-        <w:rPr>
-          <w:sz w:val="28"/>
-          <w:szCs w:val="28"/>
-        </w:rPr>
-      </w:pPr>
-      <w:r>
-        <w:rPr>
-          <w:sz w:val="28"/>
-          <w:szCs w:val="28"/>
-        </w:rPr>
-        <w:t xml:space="preserve">После регистрации нужно нажать </w:t>
-      </w:r>
-      <w:r>
-        <w:rPr>
-          <w:sz w:val="28"/>
-          <w:szCs w:val="28"/>
-          <w:lang w:val="en-US"/>
-        </w:rPr>
-        <w:t>Create</w:t>
-      </w:r>
-      <w:r>
-        <w:rPr>
-          <w:sz w:val="28"/>
-          <w:szCs w:val="28"/>
-        </w:rPr>
-        <w:t xml:space="preserve"> </w:t>
-      </w:r>
-      <w:r>
-        <w:rPr>
-          <w:sz w:val="28"/>
-          <w:szCs w:val="28"/>
-          <w:lang w:val="en-US"/>
-        </w:rPr>
-        <w:t>Database</w:t>
-      </w:r>
-      <w:r>
-        <w:rPr>
-          <w:sz w:val="28"/>
-          <w:szCs w:val="28"/>
-        </w:rPr>
-        <w:t xml:space="preserve"> </w:t>
-      </w:r>
-      <w:r>
-        <w:rPr>
-          <w:sz w:val="28"/>
-          <w:szCs w:val="28"/>
-        </w:rPr>
-        <w:t>и после небольшого ожидания будем перенаправлены на страницу с тестовыми данными. Результат представлен на рисунке 1.6.</w:t>
-      </w:r>
-    </w:p>
-    <w:p>
-      <w:pPr>
-        <w:spacing w:after="120"/>
-        <w:jc w:val="center"/>
-        <w:rPr>
-          <w:sz w:val="28"/>
-          <w:szCs w:val="28"/>
-        </w:rPr>
-      </w:pPr>
-      <w:r>
-        <w:rPr>
-          <w:sz w:val="28"/>
-          <w:szCs w:val="28"/>
-        </w:rPr>
-        <w:lastRenderedPageBreak/>
-        <w:drawing>
-          <wp:inline distT="0" distB="0" distL="0" distR="0" wp14:anchorId="381D2BFE" wp14:editId="493BA685">
-            <wp:extent cx="4206240" cy="2268058"/>
-            <wp:effectExtent l="0" t="0" r="3810" b="0"/>
-            <wp:docPr id="6" name="Рисунок 6"/>
             <wp:cNvGraphicFramePr>
               <a:graphicFrameLocks xmlns:a="http://schemas.openxmlformats.org/drawingml/2006/main" noChangeAspect="1"/>
             </wp:cNvGraphicFramePr>
@@ -1666,6 +1530,140 @@
                   <pic:spPr>
                     <a:xfrm>
                       <a:off x="0" y="0"/>
+                      <a:ext cx="4670415" cy="3784735"/>
+                    </a:xfrm>
+                    <a:prstGeom prst="rect">
+                      <a:avLst/>
+                    </a:prstGeom>
+                  </pic:spPr>
+                </pic:pic>
+              </a:graphicData>
+            </a:graphic>
+          </wp:inline>
+        </w:drawing>
+      </w:r>
+    </w:p>
+    <w:p>
+      <w:pPr>
+        <w:jc w:val="center"/>
+        <w:rPr>
+          <w:sz w:val="28"/>
+          <w:szCs w:val="28"/>
+        </w:rPr>
+      </w:pPr>
+      <w:r>
+        <w:rPr>
+          <w:sz w:val="28"/>
+          <w:szCs w:val="28"/>
+        </w:rPr>
+        <w:t xml:space="preserve">Рисунок 1.5 – Регистрации в </w:t>
+      </w:r>
+      <w:proofErr w:type="spellStart"/>
+      <w:r>
+        <w:rPr>
+          <w:sz w:val="28"/>
+          <w:szCs w:val="28"/>
+          <w:lang w:val="en-US"/>
+        </w:rPr>
+        <w:t>odoo</w:t>
+      </w:r>
+      <w:proofErr w:type="spellEnd"/>
+    </w:p>
+    <w:p>
+      <w:pPr>
+        <w:spacing w:before="240"/>
+        <w:ind w:firstLine="708"/>
+        <w:jc w:val="both"/>
+        <w:rPr>
+          <w:sz w:val="28"/>
+          <w:szCs w:val="28"/>
+        </w:rPr>
+      </w:pPr>
+      <w:r>
+        <w:rPr>
+          <w:sz w:val="28"/>
+          <w:szCs w:val="28"/>
+        </w:rPr>
+        <w:t xml:space="preserve">После регистрации нужно нажать </w:t>
+      </w:r>
+      <w:r>
+        <w:rPr>
+          <w:sz w:val="28"/>
+          <w:szCs w:val="28"/>
+          <w:lang w:val="en-US"/>
+        </w:rPr>
+        <w:t>Create</w:t>
+      </w:r>
+      <w:r>
+        <w:rPr>
+          <w:sz w:val="28"/>
+          <w:szCs w:val="28"/>
+        </w:rPr>
+        <w:t xml:space="preserve"> </w:t>
+      </w:r>
+      <w:r>
+        <w:rPr>
+          <w:sz w:val="28"/>
+          <w:szCs w:val="28"/>
+          <w:lang w:val="en-US"/>
+        </w:rPr>
+        <w:t>Database</w:t>
+      </w:r>
+      <w:r>
+        <w:rPr>
+          <w:sz w:val="28"/>
+          <w:szCs w:val="28"/>
+        </w:rPr>
+        <w:t xml:space="preserve"> </w:t>
+      </w:r>
+      <w:r>
+        <w:rPr>
+          <w:sz w:val="28"/>
+          <w:szCs w:val="28"/>
+        </w:rPr>
+        <w:t>и после небольшого ожидания будем перенаправлены на страницу с тестовыми данными. Результат представлен на рисунке 1.6.</w:t>
+      </w:r>
+    </w:p>
+    <w:p>
+      <w:pPr>
+        <w:spacing w:after="120"/>
+        <w:jc w:val="center"/>
+        <w:rPr>
+          <w:sz w:val="28"/>
+          <w:szCs w:val="28"/>
+        </w:rPr>
+      </w:pPr>
+      <w:r>
+        <w:rPr>
+          <w:noProof/>
+          <w:sz w:val="28"/>
+          <w:szCs w:val="28"/>
+        </w:rPr>
+        <w:lastRenderedPageBreak/>
+        <w:drawing>
+          <wp:inline distT="0" distB="0" distL="0" distR="0" wp14:anchorId="381D2BFE" wp14:editId="493BA685">
+            <wp:extent cx="4206240" cy="2268058"/>
+            <wp:effectExtent l="0" t="0" r="3810" b="0"/>
+            <wp:docPr id="6" name="Рисунок 6"/>
+            <wp:cNvGraphicFramePr>
+              <a:graphicFrameLocks xmlns:a="http://schemas.openxmlformats.org/drawingml/2006/main" noChangeAspect="1"/>
+            </wp:cNvGraphicFramePr>
+            <a:graphic xmlns:a="http://schemas.openxmlformats.org/drawingml/2006/main">
+              <a:graphicData uri="http://schemas.openxmlformats.org/drawingml/2006/picture">
+                <pic:pic xmlns:pic="http://schemas.openxmlformats.org/drawingml/2006/picture">
+                  <pic:nvPicPr>
+                    <pic:cNvPr id="1" name=""/>
+                    <pic:cNvPicPr/>
+                  </pic:nvPicPr>
+                  <pic:blipFill>
+                    <a:blip r:embed="rId12"/>
+                    <a:stretch>
+                      <a:fillRect/>
+                    </a:stretch>
+                  </pic:blipFill>
+                  <pic:spPr>
+                    <a:xfrm>
+                      <a:off x="0" y="0"/>
                       <a:ext cx="4214085" cy="2272288"/>
                     </a:xfrm>
                     <a:prstGeom prst="rect">
@@ -1685,7 +1683,6 @@
         <w:rPr>
           <w:sz w:val="28"/>
           <w:szCs w:val="28"/>
-          <w:lang w:val="en-US"/>
         </w:rPr>
       </w:pPr>
       <w:r>
@@ -1708,11 +1705,3382 @@
     </w:p>
     <w:p>
       <w:pPr>
+        <w:spacing w:before="240"/>
+        <w:ind w:firstLine="708"/>
         <w:jc w:val="both"/>
         <w:rPr>
           <w:sz w:val="28"/>
           <w:szCs w:val="28"/>
-          <w:lang w:val="en-US"/>
+        </w:rPr>
+      </w:pPr>
+      <w:r>
+        <w:rPr>
+          <w:sz w:val="28"/>
+          <w:szCs w:val="28"/>
+        </w:rPr>
+        <w:t xml:space="preserve">Следующим шагом необходимо </w:t>
+      </w:r>
+      <w:r>
+        <w:rPr>
+          <w:sz w:val="28"/>
+          <w:szCs w:val="28"/>
+        </w:rPr>
+        <w:t>сконфигурировать ERP-систем</w:t>
+      </w:r>
+      <w:r>
+        <w:rPr>
+          <w:sz w:val="28"/>
+          <w:szCs w:val="28"/>
+          <w:lang w:val="be-BY"/>
+        </w:rPr>
+        <w:t>у</w:t>
+      </w:r>
+      <w:r>
+        <w:rPr>
+          <w:sz w:val="28"/>
+          <w:szCs w:val="28"/>
+        </w:rPr>
+        <w:t xml:space="preserve"> </w:t>
+      </w:r>
+      <w:proofErr w:type="spellStart"/>
+      <w:r>
+        <w:rPr>
+          <w:sz w:val="28"/>
+          <w:szCs w:val="28"/>
+        </w:rPr>
+        <w:t>odoo</w:t>
+      </w:r>
+      <w:proofErr w:type="spellEnd"/>
+      <w:r>
+        <w:rPr>
+          <w:sz w:val="28"/>
+          <w:szCs w:val="28"/>
+          <w:lang w:val="be-BY"/>
+        </w:rPr>
+        <w:t xml:space="preserve"> на использование </w:t>
+      </w:r>
+      <w:r>
+        <w:rPr>
+          <w:sz w:val="28"/>
+          <w:szCs w:val="28"/>
+          <w:lang w:val="en-US"/>
+        </w:rPr>
+        <w:t>SMTP</w:t>
+      </w:r>
+      <w:r>
+        <w:rPr>
+          <w:sz w:val="28"/>
+          <w:szCs w:val="28"/>
+        </w:rPr>
+        <w:t xml:space="preserve">-сервера </w:t>
+      </w:r>
+      <w:r>
+        <w:rPr>
+          <w:sz w:val="28"/>
+          <w:szCs w:val="28"/>
+          <w:lang w:val="en-US"/>
+        </w:rPr>
+        <w:t>postfix</w:t>
+      </w:r>
+      <w:r>
+        <w:rPr>
+          <w:sz w:val="28"/>
+          <w:szCs w:val="28"/>
+        </w:rPr>
+        <w:t xml:space="preserve">, входящего в состав пакета </w:t>
+      </w:r>
+      <w:proofErr w:type="spellStart"/>
+      <w:r>
+        <w:rPr>
+          <w:sz w:val="28"/>
+          <w:szCs w:val="28"/>
+        </w:rPr>
+        <w:t>iRedMail</w:t>
+      </w:r>
+      <w:proofErr w:type="spellEnd"/>
+      <w:r>
+        <w:rPr>
+          <w:sz w:val="28"/>
+          <w:szCs w:val="28"/>
+        </w:rPr>
+        <w:t xml:space="preserve">, для отправки </w:t>
+      </w:r>
+      <w:r>
+        <w:rPr>
+          <w:sz w:val="28"/>
+          <w:szCs w:val="28"/>
+          <w:lang w:val="en-US"/>
+        </w:rPr>
+        <w:t>e</w:t>
+      </w:r>
+      <w:r>
+        <w:rPr>
+          <w:sz w:val="28"/>
+          <w:szCs w:val="28"/>
+        </w:rPr>
+        <w:t>-</w:t>
+      </w:r>
+      <w:r>
+        <w:rPr>
+          <w:sz w:val="28"/>
+          <w:szCs w:val="28"/>
+          <w:lang w:val="en-US"/>
+        </w:rPr>
+        <w:t>mail</w:t>
+      </w:r>
+      <w:r>
+        <w:rPr>
+          <w:sz w:val="28"/>
+          <w:szCs w:val="28"/>
+        </w:rPr>
+        <w:t>. Результат конфигурации представлен на рисунке 1.7.</w:t>
+      </w:r>
+    </w:p>
+    <w:p>
+      <w:pPr>
+        <w:spacing w:before="240" w:after="120"/>
+        <w:jc w:val="center"/>
+        <w:rPr>
+          <w:sz w:val="28"/>
+          <w:szCs w:val="28"/>
+          <w:lang w:val="en-US"/>
+        </w:rPr>
+      </w:pPr>
+      <w:r>
+        <w:rPr>
+          <w:noProof/>
+          <w:sz w:val="28"/>
+          <w:szCs w:val="28"/>
+          <w:lang w:val="en-US"/>
+        </w:rPr>
+        <w:drawing>
+          <wp:inline distT="0" distB="0" distL="0" distR="0" wp14:anchorId="1E1BDE3E" wp14:editId="5A7C3D6D">
+            <wp:extent cx="6372225" cy="847725"/>
+            <wp:effectExtent l="0" t="0" r="9525" b="9525"/>
+            <wp:docPr id="7" name="Рисунок 7"/>
+            <wp:cNvGraphicFramePr>
+              <a:graphicFrameLocks xmlns:a="http://schemas.openxmlformats.org/drawingml/2006/main" noChangeAspect="1"/>
+            </wp:cNvGraphicFramePr>
+            <a:graphic xmlns:a="http://schemas.openxmlformats.org/drawingml/2006/main">
+              <a:graphicData uri="http://schemas.openxmlformats.org/drawingml/2006/picture">
+                <pic:pic xmlns:pic="http://schemas.openxmlformats.org/drawingml/2006/picture">
+                  <pic:nvPicPr>
+                    <pic:cNvPr id="1" name=""/>
+                    <pic:cNvPicPr/>
+                  </pic:nvPicPr>
+                  <pic:blipFill>
+                    <a:blip r:embed="rId13"/>
+                    <a:stretch>
+                      <a:fillRect/>
+                    </a:stretch>
+                  </pic:blipFill>
+                  <pic:spPr>
+                    <a:xfrm>
+                      <a:off x="0" y="0"/>
+                      <a:ext cx="6372225" cy="847725"/>
+                    </a:xfrm>
+                    <a:prstGeom prst="rect">
+                      <a:avLst/>
+                    </a:prstGeom>
+                  </pic:spPr>
+                </pic:pic>
+              </a:graphicData>
+            </a:graphic>
+          </wp:inline>
+        </w:drawing>
+      </w:r>
+    </w:p>
+    <w:p>
+      <w:pPr>
+        <w:jc w:val="center"/>
+        <w:rPr>
+          <w:sz w:val="28"/>
+          <w:szCs w:val="28"/>
+        </w:rPr>
+      </w:pPr>
+      <w:r>
+        <w:rPr>
+          <w:sz w:val="28"/>
+          <w:szCs w:val="28"/>
+        </w:rPr>
+        <w:t xml:space="preserve">Рисунок 1.7 – Результат конфигурации </w:t>
+      </w:r>
+      <w:proofErr w:type="spellStart"/>
+      <w:r>
+        <w:rPr>
+          <w:sz w:val="28"/>
+          <w:szCs w:val="28"/>
+          <w:lang w:val="en-US"/>
+        </w:rPr>
+        <w:t>odoo</w:t>
+      </w:r>
+      <w:proofErr w:type="spellEnd"/>
+      <w:r>
+        <w:rPr>
+          <w:sz w:val="28"/>
+          <w:szCs w:val="28"/>
+        </w:rPr>
+        <w:t xml:space="preserve"> </w:t>
+      </w:r>
+      <w:r>
+        <w:rPr>
+          <w:sz w:val="28"/>
+          <w:szCs w:val="28"/>
+        </w:rPr>
+        <w:t xml:space="preserve">для работы с </w:t>
+      </w:r>
+      <w:r>
+        <w:rPr>
+          <w:sz w:val="28"/>
+          <w:szCs w:val="28"/>
+          <w:lang w:val="en-US"/>
+        </w:rPr>
+        <w:t>postfix</w:t>
+      </w:r>
+    </w:p>
+    <w:p>
+      <w:pPr>
+        <w:spacing w:before="240"/>
+        <w:ind w:firstLine="708"/>
+        <w:jc w:val="both"/>
+        <w:rPr>
+          <w:sz w:val="28"/>
+          <w:szCs w:val="28"/>
+        </w:rPr>
+      </w:pPr>
+      <w:r>
+        <w:rPr>
+          <w:sz w:val="28"/>
+          <w:szCs w:val="28"/>
+        </w:rPr>
+        <w:t xml:space="preserve">После этого необходимо </w:t>
+      </w:r>
+      <w:r>
+        <w:rPr>
+          <w:sz w:val="28"/>
+          <w:szCs w:val="28"/>
+          <w:lang w:val="be-BY"/>
+        </w:rPr>
+        <w:t>сконфигурировать</w:t>
+      </w:r>
+      <w:r>
+        <w:rPr>
+          <w:sz w:val="28"/>
+          <w:szCs w:val="28"/>
+        </w:rPr>
+        <w:t xml:space="preserve"> </w:t>
+      </w:r>
+      <w:r>
+        <w:rPr>
+          <w:sz w:val="28"/>
+          <w:szCs w:val="28"/>
+          <w:lang w:val="be-BY"/>
+        </w:rPr>
+        <w:t xml:space="preserve">SMTP-сервер postfix на прием писем из </w:t>
+      </w:r>
+      <w:r>
+        <w:rPr>
+          <w:sz w:val="28"/>
+          <w:szCs w:val="28"/>
+          <w:lang w:val="en-US"/>
+        </w:rPr>
+        <w:t>docker</w:t>
+      </w:r>
+      <w:r>
+        <w:rPr>
+          <w:sz w:val="28"/>
+          <w:szCs w:val="28"/>
+        </w:rPr>
+        <w:t xml:space="preserve">-контейнера с </w:t>
+      </w:r>
+      <w:r>
+        <w:rPr>
+          <w:sz w:val="28"/>
+          <w:szCs w:val="28"/>
+          <w:lang w:val="en-US"/>
+        </w:rPr>
+        <w:t>ERP</w:t>
+      </w:r>
+      <w:r>
+        <w:rPr>
+          <w:sz w:val="28"/>
+          <w:szCs w:val="28"/>
+        </w:rPr>
+        <w:t xml:space="preserve">-системой </w:t>
+      </w:r>
+      <w:proofErr w:type="spellStart"/>
+      <w:r>
+        <w:rPr>
+          <w:sz w:val="28"/>
+          <w:szCs w:val="28"/>
+          <w:lang w:val="en-US"/>
+        </w:rPr>
+        <w:t>odoo</w:t>
+      </w:r>
+      <w:proofErr w:type="spellEnd"/>
+      <w:r>
+        <w:rPr>
+          <w:sz w:val="28"/>
+          <w:szCs w:val="28"/>
+        </w:rPr>
+        <w:t xml:space="preserve">. Для этого изменим конфигурационный файл </w:t>
+      </w:r>
+      <w:r>
+        <w:rPr>
+          <w:sz w:val="28"/>
+          <w:szCs w:val="28"/>
+          <w:lang w:val="en-US"/>
+        </w:rPr>
+        <w:t>postfix</w:t>
+      </w:r>
+      <w:r>
+        <w:rPr>
+          <w:sz w:val="28"/>
+          <w:szCs w:val="28"/>
+        </w:rPr>
+        <w:t xml:space="preserve"> </w:t>
+      </w:r>
+      <w:r>
+        <w:rPr>
+          <w:sz w:val="28"/>
+          <w:szCs w:val="28"/>
+        </w:rPr>
+        <w:t>и перезапустим службу. Результат представлен на рисунке 1.8.</w:t>
+      </w:r>
+    </w:p>
+    <w:p>
+      <w:pPr>
+        <w:spacing w:before="240" w:after="120"/>
+        <w:jc w:val="center"/>
+        <w:rPr>
+          <w:sz w:val="28"/>
+          <w:szCs w:val="28"/>
+        </w:rPr>
+      </w:pPr>
+      <w:r>
+        <w:rPr>
+          <w:noProof/>
+          <w:sz w:val="28"/>
+          <w:szCs w:val="28"/>
+        </w:rPr>
+        <w:drawing>
+          <wp:inline distT="0" distB="0" distL="0" distR="0" wp14:anchorId="6AE027AD" wp14:editId="65D7AD56">
+            <wp:extent cx="6372225" cy="1459230"/>
+            <wp:effectExtent l="0" t="0" r="9525" b="7620"/>
+            <wp:docPr id="8" name="Рисунок 8"/>
+            <wp:cNvGraphicFramePr>
+              <a:graphicFrameLocks xmlns:a="http://schemas.openxmlformats.org/drawingml/2006/main" noChangeAspect="1"/>
+            </wp:cNvGraphicFramePr>
+            <a:graphic xmlns:a="http://schemas.openxmlformats.org/drawingml/2006/main">
+              <a:graphicData uri="http://schemas.openxmlformats.org/drawingml/2006/picture">
+                <pic:pic xmlns:pic="http://schemas.openxmlformats.org/drawingml/2006/picture">
+                  <pic:nvPicPr>
+                    <pic:cNvPr id="1" name=""/>
+                    <pic:cNvPicPr/>
+                  </pic:nvPicPr>
+                  <pic:blipFill>
+                    <a:blip r:embed="rId14"/>
+                    <a:stretch>
+                      <a:fillRect/>
+                    </a:stretch>
+                  </pic:blipFill>
+                  <pic:spPr>
+                    <a:xfrm>
+                      <a:off x="0" y="0"/>
+                      <a:ext cx="6372225" cy="1459230"/>
+                    </a:xfrm>
+                    <a:prstGeom prst="rect">
+                      <a:avLst/>
+                    </a:prstGeom>
+                  </pic:spPr>
+                </pic:pic>
+              </a:graphicData>
+            </a:graphic>
+          </wp:inline>
+        </w:drawing>
+      </w:r>
+    </w:p>
+    <w:p>
+      <w:pPr>
+        <w:jc w:val="center"/>
+        <w:rPr>
+          <w:sz w:val="28"/>
+          <w:szCs w:val="28"/>
+        </w:rPr>
+      </w:pPr>
+      <w:r>
+        <w:rPr>
+          <w:sz w:val="28"/>
+          <w:szCs w:val="28"/>
+        </w:rPr>
+        <w:t xml:space="preserve">Рисунок 1.8 – Результат конфигурации </w:t>
+      </w:r>
+      <w:r>
+        <w:rPr>
+          <w:sz w:val="28"/>
+          <w:szCs w:val="28"/>
+          <w:lang w:val="en-US"/>
+        </w:rPr>
+        <w:t>Postfix</w:t>
+      </w:r>
+    </w:p>
+    <w:p>
+      <w:pPr>
+        <w:spacing w:before="240"/>
+        <w:ind w:firstLine="708"/>
+        <w:rPr>
+          <w:sz w:val="28"/>
+          <w:szCs w:val="28"/>
+        </w:rPr>
+      </w:pPr>
+      <w:r>
+        <w:rPr>
+          <w:sz w:val="28"/>
+          <w:szCs w:val="28"/>
+        </w:rPr>
+        <w:t xml:space="preserve">Теперь протестируем соединение </w:t>
+      </w:r>
+      <w:r>
+        <w:rPr>
+          <w:sz w:val="28"/>
+          <w:szCs w:val="28"/>
+          <w:lang w:val="en-US"/>
+        </w:rPr>
+        <w:t>Odoo</w:t>
+      </w:r>
+      <w:r>
+        <w:rPr>
+          <w:sz w:val="28"/>
+          <w:szCs w:val="28"/>
+        </w:rPr>
+        <w:t xml:space="preserve"> </w:t>
+      </w:r>
+      <w:proofErr w:type="gramStart"/>
+      <w:r>
+        <w:rPr>
+          <w:sz w:val="28"/>
+          <w:szCs w:val="28"/>
+        </w:rPr>
+        <w:t xml:space="preserve">с  </w:t>
+      </w:r>
+      <w:r>
+        <w:rPr>
+          <w:sz w:val="28"/>
+          <w:szCs w:val="28"/>
+          <w:lang w:val="en-US"/>
+        </w:rPr>
+        <w:t>Postfix</w:t>
+      </w:r>
+      <w:proofErr w:type="gramEnd"/>
+      <w:r>
+        <w:rPr>
+          <w:sz w:val="28"/>
+          <w:szCs w:val="28"/>
+        </w:rPr>
+        <w:t xml:space="preserve"> </w:t>
+      </w:r>
+      <w:r>
+        <w:rPr>
+          <w:sz w:val="28"/>
+          <w:szCs w:val="28"/>
+        </w:rPr>
+        <w:t>через интерфейс браузера. Результат представлен на рисунке 1.9.</w:t>
+      </w:r>
+    </w:p>
+    <w:p>
+      <w:pPr>
+        <w:spacing w:before="240" w:after="20"/>
+        <w:jc w:val="center"/>
+        <w:rPr>
+          <w:sz w:val="28"/>
+          <w:szCs w:val="28"/>
+        </w:rPr>
+      </w:pPr>
+      <w:r>
+        <w:rPr>
+          <w:sz w:val="28"/>
+          <w:szCs w:val="28"/>
+        </w:rPr>
+        <w:drawing>
+          <wp:inline distT="0" distB="0" distL="0" distR="0" wp14:anchorId="57DF1167" wp14:editId="23AB8C4A">
+            <wp:extent cx="5887272" cy="990738"/>
+            <wp:effectExtent l="0" t="0" r="0" b="0"/>
+            <wp:docPr id="9" name="Рисунок 9"/>
+            <wp:cNvGraphicFramePr>
+              <a:graphicFrameLocks xmlns:a="http://schemas.openxmlformats.org/drawingml/2006/main" noChangeAspect="1"/>
+            </wp:cNvGraphicFramePr>
+            <a:graphic xmlns:a="http://schemas.openxmlformats.org/drawingml/2006/main">
+              <a:graphicData uri="http://schemas.openxmlformats.org/drawingml/2006/picture">
+                <pic:pic xmlns:pic="http://schemas.openxmlformats.org/drawingml/2006/picture">
+                  <pic:nvPicPr>
+                    <pic:cNvPr id="1" name=""/>
+                    <pic:cNvPicPr/>
+                  </pic:nvPicPr>
+                  <pic:blipFill>
+                    <a:blip r:embed="rId15"/>
+                    <a:stretch>
+                      <a:fillRect/>
+                    </a:stretch>
+                  </pic:blipFill>
+                  <pic:spPr>
+                    <a:xfrm>
+                      <a:off x="0" y="0"/>
+                      <a:ext cx="5887272" cy="990738"/>
+                    </a:xfrm>
+                    <a:prstGeom prst="rect">
+                      <a:avLst/>
+                    </a:prstGeom>
+                  </pic:spPr>
+                </pic:pic>
+              </a:graphicData>
+            </a:graphic>
+          </wp:inline>
+        </w:drawing>
+      </w:r>
+    </w:p>
+    <w:p>
+      <w:pPr>
+        <w:jc w:val="center"/>
+        <w:rPr>
+          <w:sz w:val="28"/>
+          <w:szCs w:val="28"/>
+        </w:rPr>
+      </w:pPr>
+      <w:r>
+        <w:rPr>
+          <w:sz w:val="28"/>
+          <w:szCs w:val="28"/>
+        </w:rPr>
+        <w:t xml:space="preserve">Рисунок 1.9 – Результат проверки соединения </w:t>
+      </w:r>
+      <w:r>
+        <w:rPr>
+          <w:sz w:val="28"/>
+          <w:szCs w:val="28"/>
+          <w:lang w:val="en-US"/>
+        </w:rPr>
+        <w:t>Odoo</w:t>
+      </w:r>
+      <w:r>
+        <w:rPr>
+          <w:sz w:val="28"/>
+          <w:szCs w:val="28"/>
+        </w:rPr>
+        <w:t xml:space="preserve"> </w:t>
+      </w:r>
+      <w:r>
+        <w:rPr>
+          <w:sz w:val="28"/>
+          <w:szCs w:val="28"/>
+          <w:lang w:val="en-US"/>
+        </w:rPr>
+        <w:t>c</w:t>
+      </w:r>
+      <w:r>
+        <w:rPr>
+          <w:sz w:val="28"/>
+          <w:szCs w:val="28"/>
+        </w:rPr>
+        <w:t xml:space="preserve"> </w:t>
+      </w:r>
+      <w:r>
+        <w:rPr>
+          <w:sz w:val="28"/>
+          <w:szCs w:val="28"/>
+          <w:lang w:val="en-US"/>
+        </w:rPr>
+        <w:t>Postfix</w:t>
+      </w:r>
+    </w:p>
+    <w:p>
+      <w:pPr>
+        <w:ind w:firstLine="708"/>
+        <w:jc w:val="both"/>
+        <w:rPr>
+          <w:sz w:val="28"/>
+          <w:szCs w:val="28"/>
+        </w:rPr>
+      </w:pPr>
+      <w:r>
+        <w:rPr>
+          <w:sz w:val="28"/>
+          <w:szCs w:val="28"/>
+        </w:rPr>
+        <w:lastRenderedPageBreak/>
+        <w:t xml:space="preserve">Теперь с помощью админ-панели </w:t>
+      </w:r>
+      <w:proofErr w:type="spellStart"/>
+      <w:r>
+        <w:rPr>
+          <w:sz w:val="28"/>
+          <w:szCs w:val="28"/>
+        </w:rPr>
+        <w:t>iRedMail</w:t>
+      </w:r>
+      <w:proofErr w:type="spellEnd"/>
+      <w:r>
+        <w:rPr>
+          <w:sz w:val="28"/>
+          <w:szCs w:val="28"/>
+        </w:rPr>
+        <w:t xml:space="preserve"> </w:t>
+      </w:r>
+      <w:r>
+        <w:rPr>
+          <w:sz w:val="28"/>
+          <w:szCs w:val="28"/>
+        </w:rPr>
+        <w:t xml:space="preserve">создадим нового пользователя, назовём его </w:t>
+      </w:r>
+      <w:proofErr w:type="spellStart"/>
+      <w:r>
+        <w:rPr>
+          <w:sz w:val="28"/>
+          <w:szCs w:val="28"/>
+          <w:lang w:val="en-US"/>
+        </w:rPr>
+        <w:t>odoo</w:t>
+      </w:r>
+      <w:proofErr w:type="spellEnd"/>
+      <w:r>
+        <w:rPr>
+          <w:sz w:val="28"/>
+          <w:szCs w:val="28"/>
+        </w:rPr>
+        <w:t>_</w:t>
+      </w:r>
+      <w:r>
+        <w:rPr>
+          <w:sz w:val="28"/>
+          <w:szCs w:val="28"/>
+          <w:lang w:val="en-US"/>
+        </w:rPr>
+        <w:t>user</w:t>
+      </w:r>
+      <w:r>
+        <w:rPr>
+          <w:sz w:val="28"/>
+          <w:szCs w:val="28"/>
+        </w:rPr>
+        <w:t xml:space="preserve"> </w:t>
+      </w:r>
+      <w:r>
+        <w:rPr>
+          <w:sz w:val="28"/>
+          <w:szCs w:val="28"/>
+        </w:rPr>
+        <w:t>(</w:t>
+      </w:r>
+      <w:r>
+        <w:rPr>
+          <w:sz w:val="28"/>
+          <w:szCs w:val="28"/>
+        </w:rPr>
+        <w:t xml:space="preserve">пароль: </w:t>
+      </w:r>
+      <w:r>
+        <w:rPr>
+          <w:sz w:val="28"/>
+          <w:szCs w:val="28"/>
+        </w:rPr>
+        <w:t>1</w:t>
+      </w:r>
+      <w:r>
+        <w:rPr>
+          <w:sz w:val="28"/>
+          <w:szCs w:val="28"/>
+          <w:lang w:val="en-US"/>
+        </w:rPr>
+        <w:t>Odoo</w:t>
+      </w:r>
+      <w:r>
+        <w:rPr>
+          <w:sz w:val="28"/>
+          <w:szCs w:val="28"/>
+        </w:rPr>
+        <w:t>_</w:t>
+      </w:r>
+      <w:r>
+        <w:rPr>
+          <w:sz w:val="28"/>
+          <w:szCs w:val="28"/>
+          <w:lang w:val="en-US"/>
+        </w:rPr>
+        <w:t>pass</w:t>
+      </w:r>
+      <w:r>
+        <w:rPr>
+          <w:sz w:val="28"/>
+          <w:szCs w:val="28"/>
+        </w:rPr>
+        <w:t>!)</w:t>
+      </w:r>
+      <w:r>
+        <w:rPr>
+          <w:sz w:val="28"/>
+          <w:szCs w:val="28"/>
+        </w:rPr>
+        <w:t>. Результат создания пользователя представлен на рисунке 1.10.</w:t>
+      </w:r>
+    </w:p>
+    <w:p>
+      <w:pPr>
+        <w:spacing w:before="240" w:after="120"/>
+        <w:jc w:val="center"/>
+        <w:rPr>
+          <w:sz w:val="28"/>
+          <w:szCs w:val="28"/>
+        </w:rPr>
+      </w:pPr>
+      <w:r>
+        <w:rPr>
+          <w:sz w:val="28"/>
+          <w:szCs w:val="28"/>
+        </w:rPr>
+        <w:drawing>
+          <wp:inline distT="0" distB="0" distL="0" distR="0" wp14:anchorId="7322E80D" wp14:editId="0425723C">
+            <wp:extent cx="6372225" cy="2553970"/>
+            <wp:effectExtent l="0" t="0" r="9525" b="0"/>
+            <wp:docPr id="10" name="Рисунок 10"/>
+            <wp:cNvGraphicFramePr>
+              <a:graphicFrameLocks xmlns:a="http://schemas.openxmlformats.org/drawingml/2006/main" noChangeAspect="1"/>
+            </wp:cNvGraphicFramePr>
+            <a:graphic xmlns:a="http://schemas.openxmlformats.org/drawingml/2006/main">
+              <a:graphicData uri="http://schemas.openxmlformats.org/drawingml/2006/picture">
+                <pic:pic xmlns:pic="http://schemas.openxmlformats.org/drawingml/2006/picture">
+                  <pic:nvPicPr>
+                    <pic:cNvPr id="1" name=""/>
+                    <pic:cNvPicPr/>
+                  </pic:nvPicPr>
+                  <pic:blipFill>
+                    <a:blip r:embed="rId16"/>
+                    <a:stretch>
+                      <a:fillRect/>
+                    </a:stretch>
+                  </pic:blipFill>
+                  <pic:spPr>
+                    <a:xfrm>
+                      <a:off x="0" y="0"/>
+                      <a:ext cx="6372225" cy="2553970"/>
+                    </a:xfrm>
+                    <a:prstGeom prst="rect">
+                      <a:avLst/>
+                    </a:prstGeom>
+                  </pic:spPr>
+                </pic:pic>
+              </a:graphicData>
+            </a:graphic>
+          </wp:inline>
+        </w:drawing>
+      </w:r>
+    </w:p>
+    <w:p>
+      <w:pPr>
+        <w:jc w:val="center"/>
+        <w:rPr>
+          <w:sz w:val="28"/>
+          <w:szCs w:val="28"/>
+          <w:lang w:val="en-US"/>
+        </w:rPr>
+      </w:pPr>
+      <w:r>
+        <w:rPr>
+          <w:sz w:val="28"/>
+          <w:szCs w:val="28"/>
+        </w:rPr>
+        <w:t xml:space="preserve">Рисунок 1.10 – Результат создания нового пользователя в </w:t>
+      </w:r>
+      <w:proofErr w:type="spellStart"/>
+      <w:r>
+        <w:rPr>
+          <w:sz w:val="28"/>
+          <w:szCs w:val="28"/>
+          <w:lang w:val="en-US"/>
+        </w:rPr>
+        <w:t>iRedMail</w:t>
+      </w:r>
+      <w:proofErr w:type="spellEnd"/>
+    </w:p>
+    <w:p>
+      <w:pPr>
+        <w:spacing w:before="240"/>
+        <w:ind w:firstLine="708"/>
+        <w:jc w:val="both"/>
+        <w:rPr>
+          <w:sz w:val="28"/>
+          <w:szCs w:val="28"/>
+          <w:lang w:val="be-BY"/>
+        </w:rPr>
+      </w:pPr>
+      <w:r>
+        <w:rPr>
+          <w:sz w:val="28"/>
+          <w:szCs w:val="28"/>
+        </w:rPr>
+        <w:t xml:space="preserve">После этого в системе </w:t>
+      </w:r>
+      <w:proofErr w:type="spellStart"/>
+      <w:r>
+        <w:rPr>
+          <w:sz w:val="28"/>
+          <w:szCs w:val="28"/>
+          <w:lang w:val="en-US"/>
+        </w:rPr>
+        <w:t>odoo</w:t>
+      </w:r>
+      <w:proofErr w:type="spellEnd"/>
+      <w:r>
+        <w:rPr>
+          <w:sz w:val="28"/>
+          <w:szCs w:val="28"/>
+        </w:rPr>
+        <w:t xml:space="preserve"> </w:t>
+      </w:r>
+      <w:r>
+        <w:rPr>
+          <w:sz w:val="28"/>
+          <w:szCs w:val="28"/>
+          <w:lang w:val="be-BY"/>
+        </w:rPr>
+        <w:t>необходимо создать соответствующего пользователя, использующего ранее созданный почтовый ящик, и назначить ему полный доступ к бухгалтерским функциям. Результат представлен на рисунке 1.11.</w:t>
+      </w:r>
+    </w:p>
+    <w:p>
+      <w:pPr>
+        <w:spacing w:before="240" w:after="120"/>
+        <w:jc w:val="center"/>
+        <w:rPr>
+          <w:sz w:val="28"/>
+          <w:szCs w:val="28"/>
+          <w:lang w:val="be-BY"/>
+        </w:rPr>
+      </w:pPr>
+      <w:r>
+        <w:rPr>
+          <w:sz w:val="28"/>
+          <w:szCs w:val="28"/>
+          <w:lang w:val="be-BY"/>
+        </w:rPr>
+        <w:drawing>
+          <wp:inline distT="0" distB="0" distL="0" distR="0" wp14:anchorId="57D4C25A" wp14:editId="7FAD2A83">
+            <wp:extent cx="6372225" cy="876300"/>
+            <wp:effectExtent l="0" t="0" r="9525" b="0"/>
+            <wp:docPr id="11" name="Рисунок 11"/>
+            <wp:cNvGraphicFramePr>
+              <a:graphicFrameLocks xmlns:a="http://schemas.openxmlformats.org/drawingml/2006/main" noChangeAspect="1"/>
+            </wp:cNvGraphicFramePr>
+            <a:graphic xmlns:a="http://schemas.openxmlformats.org/drawingml/2006/main">
+              <a:graphicData uri="http://schemas.openxmlformats.org/drawingml/2006/picture">
+                <pic:pic xmlns:pic="http://schemas.openxmlformats.org/drawingml/2006/picture">
+                  <pic:nvPicPr>
+                    <pic:cNvPr id="1" name=""/>
+                    <pic:cNvPicPr/>
+                  </pic:nvPicPr>
+                  <pic:blipFill>
+                    <a:blip r:embed="rId17"/>
+                    <a:stretch>
+                      <a:fillRect/>
+                    </a:stretch>
+                  </pic:blipFill>
+                  <pic:spPr>
+                    <a:xfrm>
+                      <a:off x="0" y="0"/>
+                      <a:ext cx="6372225" cy="876300"/>
+                    </a:xfrm>
+                    <a:prstGeom prst="rect">
+                      <a:avLst/>
+                    </a:prstGeom>
+                  </pic:spPr>
+                </pic:pic>
+              </a:graphicData>
+            </a:graphic>
+          </wp:inline>
+        </w:drawing>
+      </w:r>
+    </w:p>
+    <w:p>
+      <w:pPr>
+        <w:jc w:val="center"/>
+        <w:rPr>
+          <w:sz w:val="28"/>
+          <w:szCs w:val="28"/>
+          <w:lang w:val="be-BY"/>
+        </w:rPr>
+      </w:pPr>
+      <w:r>
+        <w:rPr>
+          <w:sz w:val="28"/>
+          <w:szCs w:val="28"/>
+          <w:lang w:val="be-BY"/>
+        </w:rPr>
+        <w:t>Рисунок 1.11 – Выдача пользователю прав на бухгалтерские действия</w:t>
+      </w:r>
+    </w:p>
+    <w:p>
+      <w:pPr>
+        <w:spacing w:before="240"/>
+        <w:ind w:firstLine="708"/>
+        <w:jc w:val="both"/>
+        <w:rPr>
+          <w:sz w:val="28"/>
+          <w:szCs w:val="28"/>
+        </w:rPr>
+      </w:pPr>
+      <w:r>
+        <w:rPr>
+          <w:sz w:val="28"/>
+          <w:szCs w:val="28"/>
+          <w:lang w:val="be-BY"/>
+        </w:rPr>
+        <w:t>Далее необходимо отправить письмо с подтверждением на ранее созданный почтовый ящик</w:t>
+      </w:r>
+      <w:r>
+        <w:rPr>
+          <w:sz w:val="28"/>
+          <w:szCs w:val="28"/>
+        </w:rPr>
+        <w:t>. Результат отправки письма подтверждения представлен на рисунке 1.12.</w:t>
+      </w:r>
+    </w:p>
+    <w:p>
+      <w:pPr>
+        <w:spacing w:before="240" w:after="120"/>
+        <w:jc w:val="center"/>
+        <w:rPr>
+          <w:sz w:val="28"/>
+          <w:szCs w:val="28"/>
+        </w:rPr>
+      </w:pPr>
+      <w:r>
+        <w:rPr>
+          <w:sz w:val="28"/>
+          <w:szCs w:val="28"/>
+        </w:rPr>
+        <w:drawing>
+          <wp:inline distT="0" distB="0" distL="0" distR="0" wp14:anchorId="7AC8E539" wp14:editId="701AEC78">
+            <wp:extent cx="6372225" cy="2456180"/>
+            <wp:effectExtent l="0" t="0" r="9525" b="1270"/>
+            <wp:docPr id="13" name="Рисунок 13"/>
+            <wp:cNvGraphicFramePr>
+              <a:graphicFrameLocks xmlns:a="http://schemas.openxmlformats.org/drawingml/2006/main" noChangeAspect="1"/>
+            </wp:cNvGraphicFramePr>
+            <a:graphic xmlns:a="http://schemas.openxmlformats.org/drawingml/2006/main">
+              <a:graphicData uri="http://schemas.openxmlformats.org/drawingml/2006/picture">
+                <pic:pic xmlns:pic="http://schemas.openxmlformats.org/drawingml/2006/picture">
+                  <pic:nvPicPr>
+                    <pic:cNvPr id="1" name=""/>
+                    <pic:cNvPicPr/>
+                  </pic:nvPicPr>
+                  <pic:blipFill>
+                    <a:blip r:embed="rId18"/>
+                    <a:stretch>
+                      <a:fillRect/>
+                    </a:stretch>
+                  </pic:blipFill>
+                  <pic:spPr>
+                    <a:xfrm>
+                      <a:off x="0" y="0"/>
+                      <a:ext cx="6372225" cy="2456180"/>
+                    </a:xfrm>
+                    <a:prstGeom prst="rect">
+                      <a:avLst/>
+                    </a:prstGeom>
+                  </pic:spPr>
+                </pic:pic>
+              </a:graphicData>
+            </a:graphic>
+          </wp:inline>
+        </w:drawing>
+      </w:r>
+    </w:p>
+    <w:p>
+      <w:pPr>
+        <w:jc w:val="center"/>
+        <w:rPr>
+          <w:sz w:val="28"/>
+          <w:szCs w:val="28"/>
+        </w:rPr>
+      </w:pPr>
+      <w:r>
+        <w:rPr>
+          <w:sz w:val="28"/>
+          <w:szCs w:val="28"/>
+        </w:rPr>
+        <w:t>Рисунок 1.12 – Результат отправки письма подтверждения</w:t>
+      </w:r>
+    </w:p>
+    <w:p>
+      <w:pPr>
+        <w:ind w:firstLine="708"/>
+        <w:jc w:val="both"/>
+        <w:rPr>
+          <w:sz w:val="28"/>
+          <w:szCs w:val="28"/>
+        </w:rPr>
+      </w:pPr>
+      <w:r>
+        <w:rPr>
+          <w:sz w:val="28"/>
+          <w:szCs w:val="28"/>
+        </w:rPr>
+        <w:lastRenderedPageBreak/>
+        <w:t>Нажмём</w:t>
+      </w:r>
+      <w:r>
+        <w:rPr>
+          <w:sz w:val="28"/>
+          <w:szCs w:val="28"/>
+        </w:rPr>
+        <w:t xml:space="preserve"> </w:t>
+      </w:r>
+      <w:r>
+        <w:rPr>
+          <w:sz w:val="28"/>
+          <w:szCs w:val="28"/>
+          <w:lang w:val="en-US"/>
+        </w:rPr>
+        <w:t>Accept</w:t>
+      </w:r>
+      <w:r>
+        <w:rPr>
+          <w:sz w:val="28"/>
+          <w:szCs w:val="28"/>
+        </w:rPr>
+        <w:t xml:space="preserve"> </w:t>
+      </w:r>
+      <w:r>
+        <w:rPr>
+          <w:sz w:val="28"/>
+          <w:szCs w:val="28"/>
+          <w:lang w:val="en-US"/>
+        </w:rPr>
+        <w:t>invitation</w:t>
+      </w:r>
+      <w:r>
+        <w:rPr>
+          <w:sz w:val="28"/>
+          <w:szCs w:val="28"/>
+        </w:rPr>
+        <w:t xml:space="preserve"> </w:t>
+      </w:r>
+      <w:r>
+        <w:rPr>
+          <w:sz w:val="28"/>
+          <w:szCs w:val="28"/>
+        </w:rPr>
+        <w:t>для</w:t>
+      </w:r>
+      <w:r>
+        <w:rPr>
+          <w:sz w:val="28"/>
+          <w:szCs w:val="28"/>
+        </w:rPr>
+        <w:t xml:space="preserve"> </w:t>
+      </w:r>
+      <w:r>
+        <w:rPr>
+          <w:sz w:val="28"/>
+          <w:szCs w:val="28"/>
+        </w:rPr>
+        <w:t>того</w:t>
+      </w:r>
+      <w:r>
+        <w:rPr>
+          <w:sz w:val="28"/>
+          <w:szCs w:val="28"/>
+        </w:rPr>
+        <w:t xml:space="preserve">, </w:t>
+      </w:r>
+      <w:r>
+        <w:rPr>
+          <w:sz w:val="28"/>
+          <w:szCs w:val="28"/>
+        </w:rPr>
+        <w:t xml:space="preserve">чтобы завершить регистрацию аккаунта в </w:t>
+      </w:r>
+      <w:r>
+        <w:rPr>
+          <w:sz w:val="28"/>
+          <w:szCs w:val="28"/>
+          <w:lang w:val="en-US"/>
+        </w:rPr>
+        <w:t>Odoo</w:t>
+      </w:r>
+      <w:r>
+        <w:rPr>
+          <w:sz w:val="28"/>
+          <w:szCs w:val="28"/>
+        </w:rPr>
+        <w:t>.</w:t>
+      </w:r>
+      <w:r>
+        <w:rPr>
+          <w:sz w:val="28"/>
+          <w:szCs w:val="28"/>
+        </w:rPr>
+        <w:t xml:space="preserve"> После этого нас перенаправит на страницу регистрации в </w:t>
+      </w:r>
+      <w:r>
+        <w:rPr>
+          <w:sz w:val="28"/>
+          <w:szCs w:val="28"/>
+          <w:lang w:val="en-US"/>
+        </w:rPr>
+        <w:t>Odoo</w:t>
+      </w:r>
+      <w:r>
+        <w:rPr>
+          <w:sz w:val="28"/>
+          <w:szCs w:val="28"/>
+        </w:rPr>
+        <w:t xml:space="preserve">, введём данные ранее созданного </w:t>
+      </w:r>
+      <w:r>
+        <w:rPr>
+          <w:sz w:val="28"/>
+          <w:szCs w:val="28"/>
+          <w:lang w:val="en-US"/>
+        </w:rPr>
+        <w:t>Odoo</w:t>
+      </w:r>
+      <w:r>
+        <w:rPr>
+          <w:sz w:val="28"/>
+          <w:szCs w:val="28"/>
+        </w:rPr>
+        <w:t>-</w:t>
+      </w:r>
+      <w:r>
+        <w:rPr>
+          <w:sz w:val="28"/>
+          <w:szCs w:val="28"/>
+        </w:rPr>
+        <w:t>аккаунта. Результат завершения регистрации представлен на рисунке 1.13.</w:t>
+      </w:r>
+    </w:p>
+    <w:p>
+      <w:pPr>
+        <w:spacing w:before="240" w:after="120"/>
+        <w:jc w:val="center"/>
+        <w:rPr>
+          <w:sz w:val="28"/>
+          <w:szCs w:val="28"/>
+        </w:rPr>
+      </w:pPr>
+      <w:r>
+        <w:rPr>
+          <w:sz w:val="28"/>
+          <w:szCs w:val="28"/>
+        </w:rPr>
+        <w:drawing>
+          <wp:inline distT="0" distB="0" distL="0" distR="0" wp14:anchorId="19D76B98" wp14:editId="280D52DD">
+            <wp:extent cx="6372225" cy="837565"/>
+            <wp:effectExtent l="0" t="0" r="9525" b="635"/>
+            <wp:docPr id="14" name="Рисунок 14"/>
+            <wp:cNvGraphicFramePr>
+              <a:graphicFrameLocks xmlns:a="http://schemas.openxmlformats.org/drawingml/2006/main" noChangeAspect="1"/>
+            </wp:cNvGraphicFramePr>
+            <a:graphic xmlns:a="http://schemas.openxmlformats.org/drawingml/2006/main">
+              <a:graphicData uri="http://schemas.openxmlformats.org/drawingml/2006/picture">
+                <pic:pic xmlns:pic="http://schemas.openxmlformats.org/drawingml/2006/picture">
+                  <pic:nvPicPr>
+                    <pic:cNvPr id="1" name=""/>
+                    <pic:cNvPicPr/>
+                  </pic:nvPicPr>
+                  <pic:blipFill>
+                    <a:blip r:embed="rId19"/>
+                    <a:stretch>
+                      <a:fillRect/>
+                    </a:stretch>
+                  </pic:blipFill>
+                  <pic:spPr>
+                    <a:xfrm>
+                      <a:off x="0" y="0"/>
+                      <a:ext cx="6372225" cy="837565"/>
+                    </a:xfrm>
+                    <a:prstGeom prst="rect">
+                      <a:avLst/>
+                    </a:prstGeom>
+                  </pic:spPr>
+                </pic:pic>
+              </a:graphicData>
+            </a:graphic>
+          </wp:inline>
+        </w:drawing>
+      </w:r>
+    </w:p>
+    <w:p>
+      <w:pPr>
+        <w:jc w:val="center"/>
+        <w:rPr>
+          <w:sz w:val="28"/>
+          <w:szCs w:val="28"/>
+        </w:rPr>
+      </w:pPr>
+      <w:r>
+        <w:rPr>
+          <w:sz w:val="28"/>
+          <w:szCs w:val="28"/>
+        </w:rPr>
+        <w:t xml:space="preserve">Рисунок 1.13 – Результат завершения регистрации аккаунта в </w:t>
+      </w:r>
+      <w:r>
+        <w:rPr>
+          <w:sz w:val="28"/>
+          <w:szCs w:val="28"/>
+          <w:lang w:val="en-US"/>
+        </w:rPr>
+        <w:t>Odoo</w:t>
+      </w:r>
+    </w:p>
+    <w:p>
+      <w:pPr>
+        <w:pStyle w:val="1"/>
+        <w:ind w:firstLine="708"/>
+      </w:pPr>
+      <w:r>
+        <w:t>2 Работа с установленными компонентами</w:t>
+      </w:r>
+    </w:p>
+    <w:p>
+      <w:pPr>
+        <w:pStyle w:val="aa"/>
+        <w:tabs>
+          <w:tab w:val="left" w:pos="426"/>
+        </w:tabs>
+        <w:ind w:left="0" w:firstLine="709"/>
+        <w:rPr>
+          <w:szCs w:val="28"/>
+          <w:lang w:eastAsia="ru-RU"/>
+        </w:rPr>
+      </w:pPr>
+      <w:r>
+        <w:rPr>
+          <w:szCs w:val="28"/>
+        </w:rPr>
+        <w:t>Теперь необходимо определить пути</w:t>
+      </w:r>
+      <w:r>
+        <w:rPr>
+          <w:szCs w:val="28"/>
+          <w:lang w:eastAsia="ru-RU"/>
+        </w:rPr>
+        <w:t xml:space="preserve"> в ОС Ubuntu и внутри контейнера</w:t>
+      </w:r>
+      <w:r>
+        <w:rPr>
+          <w:szCs w:val="28"/>
+          <w:lang w:val="be-BY" w:eastAsia="ru-RU"/>
+        </w:rPr>
+        <w:t xml:space="preserve"> </w:t>
+      </w:r>
+      <w:proofErr w:type="spellStart"/>
+      <w:r>
+        <w:rPr>
+          <w:szCs w:val="28"/>
+          <w:lang w:eastAsia="ru-RU"/>
+        </w:rPr>
+        <w:t>odoo</w:t>
+      </w:r>
+      <w:proofErr w:type="spellEnd"/>
+      <w:r>
+        <w:rPr>
+          <w:szCs w:val="28"/>
+          <w:lang w:eastAsia="ru-RU"/>
+        </w:rPr>
+        <w:t xml:space="preserve"> к папке, используемой </w:t>
+      </w:r>
+      <w:proofErr w:type="spellStart"/>
+      <w:r>
+        <w:rPr>
+          <w:szCs w:val="28"/>
+          <w:lang w:eastAsia="ru-RU"/>
+        </w:rPr>
+        <w:t>odoo</w:t>
+      </w:r>
+      <w:proofErr w:type="spellEnd"/>
+      <w:r>
+        <w:rPr>
+          <w:szCs w:val="28"/>
+          <w:lang w:eastAsia="ru-RU"/>
+        </w:rPr>
+        <w:t xml:space="preserve"> для размещения дополнительных модулей, с помощью </w:t>
+      </w:r>
+      <w:r>
+        <w:rPr>
+          <w:szCs w:val="28"/>
+          <w:lang w:eastAsia="ru-RU"/>
+        </w:rPr>
+        <w:t xml:space="preserve">команды </w:t>
+      </w:r>
+      <w:proofErr w:type="spellStart"/>
+      <w:r>
+        <w:rPr>
+          <w:szCs w:val="28"/>
+          <w:lang w:eastAsia="ru-RU"/>
+        </w:rPr>
+        <w:t>docker</w:t>
+      </w:r>
+      <w:proofErr w:type="spellEnd"/>
+      <w:r>
+        <w:rPr>
+          <w:szCs w:val="28"/>
+          <w:lang w:eastAsia="ru-RU"/>
+        </w:rPr>
+        <w:t xml:space="preserve"> </w:t>
+      </w:r>
+      <w:r>
+        <w:rPr>
+          <w:szCs w:val="28"/>
+          <w:lang w:val="en-US" w:eastAsia="ru-RU"/>
+        </w:rPr>
+        <w:t>inspect</w:t>
+      </w:r>
+      <w:r>
+        <w:rPr>
+          <w:szCs w:val="28"/>
+          <w:lang w:eastAsia="ru-RU"/>
+        </w:rPr>
+        <w:t xml:space="preserve"> </w:t>
+      </w:r>
+      <w:proofErr w:type="spellStart"/>
+      <w:r>
+        <w:rPr>
+          <w:szCs w:val="28"/>
+          <w:lang w:val="en-US" w:eastAsia="ru-RU"/>
+        </w:rPr>
+        <w:t>odoo</w:t>
+      </w:r>
+      <w:proofErr w:type="spellEnd"/>
+      <w:r>
+        <w:rPr>
+          <w:szCs w:val="28"/>
+          <w:lang w:eastAsia="ru-RU"/>
+        </w:rPr>
+        <w:t xml:space="preserve"> | </w:t>
+      </w:r>
+      <w:r>
+        <w:rPr>
+          <w:szCs w:val="28"/>
+          <w:lang w:val="en-US" w:eastAsia="ru-RU"/>
+        </w:rPr>
+        <w:t>less</w:t>
+      </w:r>
+      <w:r>
+        <w:rPr>
+          <w:szCs w:val="28"/>
+          <w:lang w:eastAsia="ru-RU"/>
+        </w:rPr>
+        <w:t xml:space="preserve">. </w:t>
+      </w:r>
+      <w:r>
+        <w:rPr>
+          <w:szCs w:val="28"/>
+          <w:lang w:eastAsia="ru-RU"/>
+        </w:rPr>
+        <w:t>Результат представлен на рисунке 2.1.</w:t>
+      </w:r>
+    </w:p>
+    <w:p>
+      <w:pPr>
+        <w:tabs>
+          <w:tab w:val="left" w:pos="426"/>
+        </w:tabs>
+        <w:spacing w:before="240" w:after="120"/>
+        <w:jc w:val="center"/>
+        <w:rPr>
+          <w:szCs w:val="28"/>
+        </w:rPr>
+      </w:pPr>
+      <w:r>
+        <w:rPr>
+          <w:szCs w:val="28"/>
+        </w:rPr>
+        <w:drawing>
+          <wp:inline distT="0" distB="0" distL="0" distR="0" wp14:anchorId="5FAF48B3" wp14:editId="512942F6">
+            <wp:extent cx="6372225" cy="1332230"/>
+            <wp:effectExtent l="0" t="0" r="9525" b="1270"/>
+            <wp:docPr id="15" name="Рисунок 15"/>
+            <wp:cNvGraphicFramePr>
+              <a:graphicFrameLocks xmlns:a="http://schemas.openxmlformats.org/drawingml/2006/main" noChangeAspect="1"/>
+            </wp:cNvGraphicFramePr>
+            <a:graphic xmlns:a="http://schemas.openxmlformats.org/drawingml/2006/main">
+              <a:graphicData uri="http://schemas.openxmlformats.org/drawingml/2006/picture">
+                <pic:pic xmlns:pic="http://schemas.openxmlformats.org/drawingml/2006/picture">
+                  <pic:nvPicPr>
+                    <pic:cNvPr id="1" name=""/>
+                    <pic:cNvPicPr/>
+                  </pic:nvPicPr>
+                  <pic:blipFill>
+                    <a:blip r:embed="rId20"/>
+                    <a:stretch>
+                      <a:fillRect/>
+                    </a:stretch>
+                  </pic:blipFill>
+                  <pic:spPr>
+                    <a:xfrm>
+                      <a:off x="0" y="0"/>
+                      <a:ext cx="6372225" cy="1332230"/>
+                    </a:xfrm>
+                    <a:prstGeom prst="rect">
+                      <a:avLst/>
+                    </a:prstGeom>
+                  </pic:spPr>
+                </pic:pic>
+              </a:graphicData>
+            </a:graphic>
+          </wp:inline>
+        </w:drawing>
+      </w:r>
+    </w:p>
+    <w:p>
+      <w:pPr>
+        <w:tabs>
+          <w:tab w:val="left" w:pos="426"/>
+        </w:tabs>
+        <w:jc w:val="center"/>
+        <w:rPr>
+          <w:sz w:val="28"/>
+          <w:szCs w:val="28"/>
+        </w:rPr>
+      </w:pPr>
+      <w:r>
+        <w:rPr>
+          <w:sz w:val="28"/>
+          <w:szCs w:val="28"/>
+        </w:rPr>
+        <w:t xml:space="preserve">Рисунок 2.1 – Результат поиска путей в </w:t>
+      </w:r>
+      <w:r>
+        <w:rPr>
+          <w:sz w:val="28"/>
+          <w:szCs w:val="28"/>
+        </w:rPr>
+        <w:t>докер</w:t>
+      </w:r>
+      <w:r>
+        <w:rPr>
+          <w:sz w:val="28"/>
+          <w:szCs w:val="28"/>
+        </w:rPr>
+        <w:t xml:space="preserve">-контейнере </w:t>
+      </w:r>
+      <w:proofErr w:type="spellStart"/>
+      <w:r>
+        <w:rPr>
+          <w:sz w:val="28"/>
+          <w:szCs w:val="28"/>
+          <w:lang w:val="en-US"/>
+        </w:rPr>
+        <w:t>odoo</w:t>
+      </w:r>
+      <w:proofErr w:type="spellEnd"/>
+    </w:p>
+    <w:p>
+      <w:pPr>
+        <w:pStyle w:val="aa"/>
+        <w:tabs>
+          <w:tab w:val="left" w:pos="426"/>
+        </w:tabs>
+        <w:spacing w:before="240"/>
+        <w:ind w:left="0" w:firstLine="709"/>
+        <w:rPr>
+          <w:szCs w:val="28"/>
+          <w:lang w:eastAsia="ru-RU"/>
+        </w:rPr>
+      </w:pPr>
+      <w:r>
+        <w:rPr>
+          <w:szCs w:val="28"/>
+          <w:lang w:eastAsia="ru-RU"/>
+        </w:rPr>
+        <w:t xml:space="preserve">Далее запустим командную строку </w:t>
+      </w:r>
+      <w:r>
+        <w:rPr>
+          <w:szCs w:val="28"/>
+          <w:lang w:val="en-US" w:eastAsia="ru-RU"/>
+        </w:rPr>
+        <w:t>bash</w:t>
+      </w:r>
+      <w:r>
+        <w:rPr>
+          <w:szCs w:val="28"/>
+          <w:lang w:eastAsia="ru-RU"/>
+        </w:rPr>
+        <w:t xml:space="preserve"> </w:t>
+      </w:r>
+      <w:r>
+        <w:rPr>
+          <w:szCs w:val="28"/>
+          <w:lang w:eastAsia="ru-RU"/>
+        </w:rPr>
+        <w:t xml:space="preserve">внутри контейнера </w:t>
+      </w:r>
+      <w:proofErr w:type="spellStart"/>
+      <w:r>
+        <w:rPr>
+          <w:szCs w:val="28"/>
+          <w:lang w:val="en-US" w:eastAsia="ru-RU"/>
+        </w:rPr>
+        <w:t>odoo</w:t>
+      </w:r>
+      <w:proofErr w:type="spellEnd"/>
+      <w:r>
+        <w:rPr>
+          <w:szCs w:val="28"/>
+          <w:lang w:eastAsia="ru-RU"/>
+        </w:rPr>
+        <w:t xml:space="preserve">. </w:t>
+      </w:r>
+      <w:r>
+        <w:rPr>
+          <w:szCs w:val="28"/>
+          <w:lang w:eastAsia="ru-RU"/>
+        </w:rPr>
+        <w:t>Результат представлен на рисунке 2.2.</w:t>
+      </w:r>
+    </w:p>
+    <w:p>
+      <w:pPr>
+        <w:tabs>
+          <w:tab w:val="left" w:pos="426"/>
+        </w:tabs>
+        <w:spacing w:before="240" w:after="120"/>
+        <w:jc w:val="center"/>
+        <w:rPr>
+          <w:szCs w:val="28"/>
+        </w:rPr>
+      </w:pPr>
+      <w:r>
+        <w:rPr>
+          <w:szCs w:val="28"/>
+        </w:rPr>
+        <w:drawing>
+          <wp:inline distT="0" distB="0" distL="0" distR="0" wp14:anchorId="03B4BCFB" wp14:editId="47C2971D">
+            <wp:extent cx="5334744" cy="1495634"/>
+            <wp:effectExtent l="0" t="0" r="0" b="9525"/>
+            <wp:docPr id="17" name="Рисунок 17"/>
+            <wp:cNvGraphicFramePr>
+              <a:graphicFrameLocks xmlns:a="http://schemas.openxmlformats.org/drawingml/2006/main" noChangeAspect="1"/>
+            </wp:cNvGraphicFramePr>
+            <a:graphic xmlns:a="http://schemas.openxmlformats.org/drawingml/2006/main">
+              <a:graphicData uri="http://schemas.openxmlformats.org/drawingml/2006/picture">
+                <pic:pic xmlns:pic="http://schemas.openxmlformats.org/drawingml/2006/picture">
+                  <pic:nvPicPr>
+                    <pic:cNvPr id="1" name=""/>
+                    <pic:cNvPicPr/>
+                  </pic:nvPicPr>
+                  <pic:blipFill>
+                    <a:blip r:embed="rId21"/>
+                    <a:stretch>
+                      <a:fillRect/>
+                    </a:stretch>
+                  </pic:blipFill>
+                  <pic:spPr>
+                    <a:xfrm>
+                      <a:off x="0" y="0"/>
+                      <a:ext cx="5334744" cy="1495634"/>
+                    </a:xfrm>
+                    <a:prstGeom prst="rect">
+                      <a:avLst/>
+                    </a:prstGeom>
+                  </pic:spPr>
+                </pic:pic>
+              </a:graphicData>
+            </a:graphic>
+          </wp:inline>
+        </w:drawing>
+      </w:r>
+    </w:p>
+    <w:p>
+      <w:pPr>
+        <w:tabs>
+          <w:tab w:val="left" w:pos="426"/>
+        </w:tabs>
+        <w:jc w:val="center"/>
+        <w:rPr>
+          <w:sz w:val="28"/>
+          <w:szCs w:val="28"/>
+          <w:lang w:val="en-US"/>
+        </w:rPr>
+      </w:pPr>
+      <w:r>
+        <w:rPr>
+          <w:sz w:val="28"/>
+          <w:szCs w:val="28"/>
+        </w:rPr>
+        <w:t xml:space="preserve">Рисунок 2.2 – Результат запуска командной строки </w:t>
+      </w:r>
+      <w:r>
+        <w:rPr>
+          <w:sz w:val="28"/>
+          <w:szCs w:val="28"/>
+          <w:lang w:val="en-US"/>
+        </w:rPr>
+        <w:t>bash</w:t>
+      </w:r>
+      <w:r>
+        <w:rPr>
+          <w:sz w:val="28"/>
+          <w:szCs w:val="28"/>
+        </w:rPr>
+        <w:t xml:space="preserve"> в контейнере </w:t>
+      </w:r>
+      <w:proofErr w:type="spellStart"/>
+      <w:r>
+        <w:rPr>
+          <w:sz w:val="28"/>
+          <w:szCs w:val="28"/>
+          <w:lang w:val="en-US"/>
+        </w:rPr>
+        <w:t>odoo</w:t>
+      </w:r>
+      <w:proofErr w:type="spellEnd"/>
+    </w:p>
+    <w:p>
+      <w:pPr>
+        <w:tabs>
+          <w:tab w:val="left" w:pos="426"/>
+        </w:tabs>
+        <w:spacing w:before="240"/>
+        <w:jc w:val="both"/>
+        <w:rPr>
+          <w:sz w:val="28"/>
+          <w:szCs w:val="28"/>
+        </w:rPr>
+      </w:pPr>
+      <w:r>
+        <w:rPr>
+          <w:sz w:val="28"/>
+          <w:szCs w:val="28"/>
+        </w:rPr>
+        <w:tab/>
+      </w:r>
+      <w:r>
+        <w:rPr>
+          <w:sz w:val="28"/>
+          <w:szCs w:val="28"/>
+        </w:rPr>
+        <w:t xml:space="preserve">После этого в командной строке </w:t>
+      </w:r>
+      <w:r>
+        <w:rPr>
+          <w:sz w:val="28"/>
+          <w:szCs w:val="28"/>
+          <w:lang w:val="en-US"/>
+        </w:rPr>
+        <w:t>bash</w:t>
+      </w:r>
+      <w:r>
+        <w:rPr>
+          <w:sz w:val="28"/>
+          <w:szCs w:val="28"/>
+        </w:rPr>
+        <w:t xml:space="preserve"> </w:t>
+      </w:r>
+      <w:r>
+        <w:rPr>
+          <w:sz w:val="28"/>
+          <w:szCs w:val="28"/>
+        </w:rPr>
+        <w:t>создадим заготовку модуля в папке для дополнительных модулей. Результат представлен на рисунке 2.3.</w:t>
+      </w:r>
+    </w:p>
+    <w:p>
+      <w:pPr>
+        <w:tabs>
+          <w:tab w:val="left" w:pos="426"/>
+        </w:tabs>
+        <w:spacing w:before="240" w:after="120"/>
+        <w:jc w:val="center"/>
+        <w:rPr>
+          <w:sz w:val="28"/>
+          <w:szCs w:val="28"/>
+        </w:rPr>
+      </w:pPr>
+      <w:r>
+        <w:rPr>
+          <w:sz w:val="28"/>
+          <w:szCs w:val="28"/>
+        </w:rPr>
+        <w:drawing>
+          <wp:inline distT="0" distB="0" distL="0" distR="0" wp14:anchorId="3699A327" wp14:editId="137E30F5">
+            <wp:extent cx="6372225" cy="866140"/>
+            <wp:effectExtent l="0" t="0" r="9525" b="0"/>
+            <wp:docPr id="18" name="Рисунок 18"/>
+            <wp:cNvGraphicFramePr>
+              <a:graphicFrameLocks xmlns:a="http://schemas.openxmlformats.org/drawingml/2006/main" noChangeAspect="1"/>
+            </wp:cNvGraphicFramePr>
+            <a:graphic xmlns:a="http://schemas.openxmlformats.org/drawingml/2006/main">
+              <a:graphicData uri="http://schemas.openxmlformats.org/drawingml/2006/picture">
+                <pic:pic xmlns:pic="http://schemas.openxmlformats.org/drawingml/2006/picture">
+                  <pic:nvPicPr>
+                    <pic:cNvPr id="1" name=""/>
+                    <pic:cNvPicPr/>
+                  </pic:nvPicPr>
+                  <pic:blipFill>
+                    <a:blip r:embed="rId22"/>
+                    <a:stretch>
+                      <a:fillRect/>
+                    </a:stretch>
+                  </pic:blipFill>
+                  <pic:spPr>
+                    <a:xfrm>
+                      <a:off x="0" y="0"/>
+                      <a:ext cx="6372225" cy="866140"/>
+                    </a:xfrm>
+                    <a:prstGeom prst="rect">
+                      <a:avLst/>
+                    </a:prstGeom>
+                  </pic:spPr>
+                </pic:pic>
+              </a:graphicData>
+            </a:graphic>
+          </wp:inline>
+        </w:drawing>
+      </w:r>
+    </w:p>
+    <w:p>
+      <w:pPr>
+        <w:tabs>
+          <w:tab w:val="left" w:pos="426"/>
+        </w:tabs>
+        <w:jc w:val="center"/>
+        <w:rPr>
+          <w:sz w:val="28"/>
+          <w:szCs w:val="28"/>
+        </w:rPr>
+      </w:pPr>
+      <w:r>
+        <w:rPr>
+          <w:sz w:val="28"/>
+          <w:szCs w:val="28"/>
+        </w:rPr>
+        <w:t>Рисунок 2.3 – Результат создания заготовки модуля</w:t>
+      </w:r>
+    </w:p>
+    <w:p>
+      <w:pPr>
+        <w:tabs>
+          <w:tab w:val="left" w:pos="426"/>
+        </w:tabs>
+        <w:jc w:val="both"/>
+        <w:rPr>
+          <w:sz w:val="28"/>
+          <w:szCs w:val="28"/>
+        </w:rPr>
+      </w:pPr>
+      <w:r>
+        <w:rPr>
+          <w:sz w:val="28"/>
+          <w:szCs w:val="28"/>
+        </w:rPr>
+        <w:lastRenderedPageBreak/>
+        <w:tab/>
+      </w:r>
+      <w:r>
+        <w:rPr>
+          <w:sz w:val="28"/>
+          <w:szCs w:val="28"/>
+        </w:rPr>
+        <w:t xml:space="preserve">Далее – скачаем с официального </w:t>
+      </w:r>
+      <w:r>
+        <w:rPr>
+          <w:sz w:val="28"/>
+          <w:szCs w:val="28"/>
+          <w:lang w:val="en-US"/>
+        </w:rPr>
+        <w:t>GitHub</w:t>
+      </w:r>
+      <w:r>
+        <w:rPr>
+          <w:sz w:val="28"/>
+          <w:szCs w:val="28"/>
+        </w:rPr>
+        <w:t xml:space="preserve"> проекта архив с исходным кодом </w:t>
+      </w:r>
+      <w:proofErr w:type="spellStart"/>
+      <w:r>
+        <w:rPr>
+          <w:sz w:val="28"/>
+          <w:szCs w:val="28"/>
+          <w:lang w:val="en-US"/>
+        </w:rPr>
+        <w:t>odoo</w:t>
+      </w:r>
+      <w:proofErr w:type="spellEnd"/>
+      <w:r>
+        <w:rPr>
+          <w:sz w:val="28"/>
+          <w:szCs w:val="28"/>
+        </w:rPr>
+        <w:t xml:space="preserve"> (версии 17.0, соответствующей версии </w:t>
+      </w:r>
+      <w:proofErr w:type="spellStart"/>
+      <w:r>
+        <w:rPr>
+          <w:sz w:val="28"/>
+          <w:szCs w:val="28"/>
+          <w:lang w:val="en-US"/>
+        </w:rPr>
+        <w:t>odoo</w:t>
+      </w:r>
+      <w:proofErr w:type="spellEnd"/>
+      <w:r>
+        <w:rPr>
+          <w:sz w:val="28"/>
+          <w:szCs w:val="28"/>
+        </w:rPr>
+        <w:t xml:space="preserve"> </w:t>
+      </w:r>
+      <w:r>
+        <w:rPr>
+          <w:sz w:val="28"/>
+          <w:szCs w:val="28"/>
+        </w:rPr>
+        <w:t>в докер-контейнере) и распакуем его в папку. Результат представлен на рисунке 2.4.</w:t>
+      </w:r>
+    </w:p>
+    <w:p>
+      <w:pPr>
+        <w:tabs>
+          <w:tab w:val="left" w:pos="426"/>
+        </w:tabs>
+        <w:spacing w:before="240" w:after="120"/>
+        <w:jc w:val="center"/>
+        <w:rPr>
+          <w:sz w:val="28"/>
+          <w:szCs w:val="28"/>
+        </w:rPr>
+      </w:pPr>
+      <w:r>
+        <w:rPr>
+          <w:sz w:val="28"/>
+          <w:szCs w:val="28"/>
+        </w:rPr>
+        <w:drawing>
+          <wp:inline distT="0" distB="0" distL="0" distR="0" wp14:anchorId="4D4D6C7B" wp14:editId="013E787D">
+            <wp:extent cx="6372225" cy="3196590"/>
+            <wp:effectExtent l="0" t="0" r="9525" b="3810"/>
+            <wp:docPr id="19" name="Рисунок 19"/>
+            <wp:cNvGraphicFramePr>
+              <a:graphicFrameLocks xmlns:a="http://schemas.openxmlformats.org/drawingml/2006/main" noChangeAspect="1"/>
+            </wp:cNvGraphicFramePr>
+            <a:graphic xmlns:a="http://schemas.openxmlformats.org/drawingml/2006/main">
+              <a:graphicData uri="http://schemas.openxmlformats.org/drawingml/2006/picture">
+                <pic:pic xmlns:pic="http://schemas.openxmlformats.org/drawingml/2006/picture">
+                  <pic:nvPicPr>
+                    <pic:cNvPr id="1" name=""/>
+                    <pic:cNvPicPr/>
+                  </pic:nvPicPr>
+                  <pic:blipFill>
+                    <a:blip r:embed="rId23"/>
+                    <a:stretch>
+                      <a:fillRect/>
+                    </a:stretch>
+                  </pic:blipFill>
+                  <pic:spPr>
+                    <a:xfrm>
+                      <a:off x="0" y="0"/>
+                      <a:ext cx="6372225" cy="3196590"/>
+                    </a:xfrm>
+                    <a:prstGeom prst="rect">
+                      <a:avLst/>
+                    </a:prstGeom>
+                  </pic:spPr>
+                </pic:pic>
+              </a:graphicData>
+            </a:graphic>
+          </wp:inline>
+        </w:drawing>
+      </w:r>
+    </w:p>
+    <w:p>
+      <w:pPr>
+        <w:tabs>
+          <w:tab w:val="left" w:pos="426"/>
+        </w:tabs>
+        <w:jc w:val="center"/>
+        <w:rPr>
+          <w:sz w:val="28"/>
+          <w:szCs w:val="28"/>
+          <w:lang w:val="en-US"/>
+        </w:rPr>
+      </w:pPr>
+      <w:r>
+        <w:rPr>
+          <w:sz w:val="28"/>
+          <w:szCs w:val="28"/>
+        </w:rPr>
+        <w:t xml:space="preserve">Рисунок 2.4 – Результат распаковки архива с исходным кодом </w:t>
+      </w:r>
+      <w:proofErr w:type="spellStart"/>
+      <w:r>
+        <w:rPr>
+          <w:sz w:val="28"/>
+          <w:szCs w:val="28"/>
+          <w:lang w:val="en-US"/>
+        </w:rPr>
+        <w:t>odoo</w:t>
+      </w:r>
+      <w:proofErr w:type="spellEnd"/>
+    </w:p>
+    <w:p>
+      <w:pPr>
+        <w:tabs>
+          <w:tab w:val="left" w:pos="426"/>
+        </w:tabs>
+        <w:spacing w:before="240"/>
+        <w:jc w:val="both"/>
+        <w:rPr>
+          <w:sz w:val="28"/>
+          <w:szCs w:val="28"/>
+        </w:rPr>
+      </w:pPr>
+      <w:r>
+        <w:rPr>
+          <w:sz w:val="28"/>
+          <w:szCs w:val="28"/>
+        </w:rPr>
+        <w:tab/>
+      </w:r>
+      <w:r>
+        <w:rPr>
+          <w:sz w:val="28"/>
+          <w:szCs w:val="28"/>
+        </w:rPr>
+        <w:t xml:space="preserve">Далее скопируем из файловой системы докер-контейнера </w:t>
+      </w:r>
+      <w:proofErr w:type="spellStart"/>
+      <w:r>
+        <w:rPr>
+          <w:sz w:val="28"/>
+          <w:szCs w:val="28"/>
+          <w:lang w:val="en-US"/>
+        </w:rPr>
+        <w:t>odoo</w:t>
+      </w:r>
+      <w:proofErr w:type="spellEnd"/>
+      <w:r>
+        <w:rPr>
+          <w:sz w:val="28"/>
+          <w:szCs w:val="28"/>
+        </w:rPr>
+        <w:t xml:space="preserve"> </w:t>
+      </w:r>
+      <w:r>
+        <w:rPr>
+          <w:sz w:val="28"/>
+          <w:szCs w:val="28"/>
+        </w:rPr>
+        <w:t xml:space="preserve">папку </w:t>
+      </w:r>
+      <w:r>
+        <w:rPr>
+          <w:sz w:val="28"/>
+          <w:szCs w:val="28"/>
+          <w:lang w:val="en-US"/>
+        </w:rPr>
+        <w:t>test</w:t>
+      </w:r>
+      <w:r>
+        <w:rPr>
+          <w:sz w:val="28"/>
+          <w:szCs w:val="28"/>
+        </w:rPr>
+        <w:t>_</w:t>
+      </w:r>
+      <w:r>
+        <w:rPr>
+          <w:sz w:val="28"/>
+          <w:szCs w:val="28"/>
+          <w:lang w:val="en-US"/>
+        </w:rPr>
+        <w:t>module</w:t>
+      </w:r>
+      <w:r>
+        <w:rPr>
+          <w:sz w:val="28"/>
+          <w:szCs w:val="28"/>
+        </w:rPr>
+        <w:t xml:space="preserve"> </w:t>
+      </w:r>
+      <w:r>
+        <w:rPr>
+          <w:sz w:val="28"/>
+          <w:szCs w:val="28"/>
+        </w:rPr>
+        <w:t xml:space="preserve">в домашнюю директорию </w:t>
+      </w:r>
+      <w:proofErr w:type="spellStart"/>
+      <w:r>
+        <w:rPr>
+          <w:sz w:val="28"/>
+          <w:szCs w:val="28"/>
+          <w:lang w:val="en-US"/>
+        </w:rPr>
+        <w:t>ftpuser</w:t>
+      </w:r>
+      <w:proofErr w:type="spellEnd"/>
+      <w:r>
+        <w:rPr>
+          <w:sz w:val="28"/>
+          <w:szCs w:val="28"/>
+        </w:rPr>
+        <w:t xml:space="preserve">, с которого и будет осуществляться соединения по </w:t>
+      </w:r>
+      <w:r>
+        <w:rPr>
+          <w:sz w:val="28"/>
+          <w:szCs w:val="28"/>
+          <w:lang w:val="en-US"/>
+        </w:rPr>
+        <w:t>ftp</w:t>
+      </w:r>
+      <w:r>
+        <w:rPr>
+          <w:sz w:val="28"/>
+          <w:szCs w:val="28"/>
+        </w:rPr>
+        <w:t xml:space="preserve">. </w:t>
+      </w:r>
+      <w:r>
+        <w:rPr>
+          <w:sz w:val="28"/>
+          <w:szCs w:val="28"/>
+          <w:lang w:val="be-BY"/>
+        </w:rPr>
+        <w:t xml:space="preserve">После этого с помощью </w:t>
+      </w:r>
+      <w:r>
+        <w:rPr>
+          <w:sz w:val="28"/>
+          <w:szCs w:val="28"/>
+          <w:lang w:val="en-US"/>
+        </w:rPr>
+        <w:t>FileZilla</w:t>
+      </w:r>
+      <w:r>
+        <w:rPr>
+          <w:sz w:val="28"/>
+          <w:szCs w:val="28"/>
+        </w:rPr>
+        <w:t xml:space="preserve"> </w:t>
+      </w:r>
+      <w:r>
+        <w:rPr>
+          <w:sz w:val="28"/>
+          <w:szCs w:val="28"/>
+        </w:rPr>
+        <w:t xml:space="preserve">установим </w:t>
+      </w:r>
+      <w:r>
+        <w:rPr>
+          <w:sz w:val="28"/>
+          <w:szCs w:val="28"/>
+          <w:lang w:val="en-US"/>
+        </w:rPr>
+        <w:t>ftp</w:t>
+      </w:r>
+      <w:r>
+        <w:rPr>
+          <w:sz w:val="28"/>
+          <w:szCs w:val="28"/>
+        </w:rPr>
+        <w:t>-</w:t>
+      </w:r>
+      <w:r>
+        <w:rPr>
+          <w:sz w:val="28"/>
+          <w:szCs w:val="28"/>
+        </w:rPr>
+        <w:t xml:space="preserve">соединения и передадим из директории </w:t>
+      </w:r>
+      <w:r>
+        <w:rPr>
+          <w:sz w:val="28"/>
+          <w:szCs w:val="28"/>
+          <w:lang w:val="en-US"/>
+        </w:rPr>
+        <w:t>ftp</w:t>
+      </w:r>
+      <w:r>
+        <w:rPr>
+          <w:sz w:val="28"/>
+          <w:szCs w:val="28"/>
+        </w:rPr>
+        <w:t xml:space="preserve">-пользователя в директорию </w:t>
+      </w:r>
+      <w:r>
+        <w:rPr>
+          <w:sz w:val="28"/>
+          <w:szCs w:val="28"/>
+          <w:lang w:val="en-US"/>
+        </w:rPr>
+        <w:t>addons</w:t>
+      </w:r>
+      <w:r>
+        <w:rPr>
+          <w:sz w:val="28"/>
+          <w:szCs w:val="28"/>
+        </w:rPr>
+        <w:t xml:space="preserve"> </w:t>
+      </w:r>
+      <w:r>
+        <w:rPr>
+          <w:sz w:val="28"/>
+          <w:szCs w:val="28"/>
+        </w:rPr>
+        <w:t>на физической машине. Результат представлен на рисунке 2.5.</w:t>
+      </w:r>
+    </w:p>
+    <w:p>
+      <w:pPr>
+        <w:tabs>
+          <w:tab w:val="left" w:pos="426"/>
+        </w:tabs>
+        <w:spacing w:before="240" w:after="120"/>
+        <w:jc w:val="center"/>
+        <w:rPr>
+          <w:sz w:val="28"/>
+          <w:szCs w:val="28"/>
+        </w:rPr>
+      </w:pPr>
+      <w:r>
+        <w:rPr>
+          <w:sz w:val="28"/>
+          <w:szCs w:val="28"/>
+        </w:rPr>
+        <w:drawing>
+          <wp:inline distT="0" distB="0" distL="0" distR="0" wp14:anchorId="66FC12DF" wp14:editId="5C33CFAA">
+            <wp:extent cx="6372225" cy="1198880"/>
+            <wp:effectExtent l="0" t="0" r="9525" b="1270"/>
+            <wp:docPr id="20" name="Рисунок 20"/>
+            <wp:cNvGraphicFramePr>
+              <a:graphicFrameLocks xmlns:a="http://schemas.openxmlformats.org/drawingml/2006/main" noChangeAspect="1"/>
+            </wp:cNvGraphicFramePr>
+            <a:graphic xmlns:a="http://schemas.openxmlformats.org/drawingml/2006/main">
+              <a:graphicData uri="http://schemas.openxmlformats.org/drawingml/2006/picture">
+                <pic:pic xmlns:pic="http://schemas.openxmlformats.org/drawingml/2006/picture">
+                  <pic:nvPicPr>
+                    <pic:cNvPr id="1" name=""/>
+                    <pic:cNvPicPr/>
+                  </pic:nvPicPr>
+                  <pic:blipFill>
+                    <a:blip r:embed="rId24"/>
+                    <a:stretch>
+                      <a:fillRect/>
+                    </a:stretch>
+                  </pic:blipFill>
+                  <pic:spPr>
+                    <a:xfrm>
+                      <a:off x="0" y="0"/>
+                      <a:ext cx="6372225" cy="1198880"/>
+                    </a:xfrm>
+                    <a:prstGeom prst="rect">
+                      <a:avLst/>
+                    </a:prstGeom>
+                  </pic:spPr>
+                </pic:pic>
+              </a:graphicData>
+            </a:graphic>
+          </wp:inline>
+        </w:drawing>
+      </w:r>
+    </w:p>
+    <w:p>
+      <w:pPr>
+        <w:tabs>
+          <w:tab w:val="left" w:pos="426"/>
+        </w:tabs>
+        <w:jc w:val="center"/>
+        <w:rPr>
+          <w:sz w:val="28"/>
+          <w:szCs w:val="28"/>
+          <w:lang w:val="en-US"/>
+        </w:rPr>
+      </w:pPr>
+      <w:r>
+        <w:rPr>
+          <w:sz w:val="28"/>
+          <w:szCs w:val="28"/>
+        </w:rPr>
+        <w:t xml:space="preserve">Рисунок 2.5 – Результат переноса директории </w:t>
+      </w:r>
+      <w:r>
+        <w:rPr>
+          <w:sz w:val="28"/>
+          <w:szCs w:val="28"/>
+          <w:lang w:val="en-US"/>
+        </w:rPr>
+        <w:t>test</w:t>
+      </w:r>
+      <w:r>
+        <w:rPr>
+          <w:sz w:val="28"/>
+          <w:szCs w:val="28"/>
+        </w:rPr>
+        <w:t>_</w:t>
+      </w:r>
+      <w:r>
+        <w:rPr>
+          <w:sz w:val="28"/>
+          <w:szCs w:val="28"/>
+          <w:lang w:val="en-US"/>
+        </w:rPr>
+        <w:t>module</w:t>
+      </w:r>
+    </w:p>
+    <w:p>
+      <w:pPr>
+        <w:tabs>
+          <w:tab w:val="left" w:pos="426"/>
+        </w:tabs>
+        <w:spacing w:before="240"/>
+        <w:jc w:val="both"/>
+        <w:rPr>
+          <w:sz w:val="28"/>
+          <w:szCs w:val="28"/>
+        </w:rPr>
+      </w:pPr>
+      <w:r>
+        <w:rPr>
+          <w:sz w:val="28"/>
+          <w:szCs w:val="28"/>
+        </w:rPr>
+        <w:t xml:space="preserve">После этого откроем папку проекта в </w:t>
+      </w:r>
+      <w:proofErr w:type="spellStart"/>
+      <w:r>
+        <w:rPr>
+          <w:sz w:val="28"/>
+          <w:szCs w:val="28"/>
+          <w:lang w:val="en-US"/>
+        </w:rPr>
+        <w:t>VSCode</w:t>
+      </w:r>
+      <w:proofErr w:type="spellEnd"/>
+      <w:r>
+        <w:rPr>
+          <w:sz w:val="28"/>
+          <w:szCs w:val="28"/>
+        </w:rPr>
+        <w:t xml:space="preserve"> </w:t>
+      </w:r>
+      <w:r>
+        <w:rPr>
+          <w:sz w:val="28"/>
+          <w:szCs w:val="28"/>
+        </w:rPr>
+        <w:t xml:space="preserve">и </w:t>
+      </w:r>
+      <w:r>
+        <w:rPr>
+          <w:sz w:val="28"/>
+          <w:szCs w:val="28"/>
+        </w:rPr>
+        <w:t xml:space="preserve">отредактируем в директории тестового модуля (поддиректория </w:t>
+      </w:r>
+      <w:r>
+        <w:rPr>
+          <w:sz w:val="28"/>
+          <w:szCs w:val="28"/>
+          <w:lang w:val="en-US"/>
+        </w:rPr>
+        <w:t>models</w:t>
+      </w:r>
+      <w:r>
+        <w:rPr>
+          <w:sz w:val="28"/>
+          <w:szCs w:val="28"/>
+        </w:rPr>
+        <w:t xml:space="preserve">) файл </w:t>
+      </w:r>
+      <w:r>
+        <w:rPr>
+          <w:sz w:val="28"/>
+          <w:szCs w:val="28"/>
+          <w:lang w:val="en-US"/>
+        </w:rPr>
+        <w:t>models</w:t>
+      </w:r>
+      <w:r>
+        <w:rPr>
+          <w:sz w:val="28"/>
+          <w:szCs w:val="28"/>
+        </w:rPr>
+        <w:t>.</w:t>
+      </w:r>
+      <w:proofErr w:type="spellStart"/>
+      <w:r>
+        <w:rPr>
+          <w:sz w:val="28"/>
+          <w:szCs w:val="28"/>
+          <w:lang w:val="en-US"/>
+        </w:rPr>
+        <w:t>py</w:t>
+      </w:r>
+      <w:proofErr w:type="spellEnd"/>
+      <w:r>
+        <w:rPr>
+          <w:sz w:val="28"/>
+          <w:szCs w:val="28"/>
+        </w:rPr>
+        <w:t xml:space="preserve">. </w:t>
+      </w:r>
+      <w:r>
+        <w:rPr>
+          <w:sz w:val="28"/>
+          <w:szCs w:val="28"/>
+        </w:rPr>
+        <w:t xml:space="preserve">Это нужно </w:t>
+      </w:r>
+      <w:r>
+        <w:rPr>
+          <w:sz w:val="28"/>
+          <w:szCs w:val="28"/>
+        </w:rPr>
+        <w:t>в первую очередь</w:t>
+      </w:r>
+      <w:r>
+        <w:rPr>
+          <w:sz w:val="28"/>
+          <w:szCs w:val="28"/>
+        </w:rPr>
+        <w:t xml:space="preserve"> для того, чтобы</w:t>
+      </w:r>
+      <w:r>
+        <w:rPr>
+          <w:sz w:val="28"/>
+          <w:szCs w:val="28"/>
+        </w:rPr>
+        <w:t xml:space="preserve"> обеспечить хранение номеров счетов работников с помощью</w:t>
+      </w:r>
+      <w:r>
+        <w:rPr>
+          <w:sz w:val="28"/>
+          <w:szCs w:val="28"/>
+        </w:rPr>
+        <w:t xml:space="preserve"> создаваемой</w:t>
+      </w:r>
+      <w:r>
+        <w:rPr>
+          <w:sz w:val="28"/>
+          <w:szCs w:val="28"/>
+        </w:rPr>
+        <w:t xml:space="preserve"> модели</w:t>
+      </w:r>
+      <w:r>
+        <w:rPr>
+          <w:sz w:val="28"/>
+          <w:szCs w:val="28"/>
+        </w:rPr>
+        <w:t>.</w:t>
+      </w:r>
+      <w:r>
+        <w:rPr>
+          <w:sz w:val="28"/>
+          <w:szCs w:val="28"/>
+        </w:rPr>
+        <w:t xml:space="preserve"> </w:t>
+      </w:r>
+      <w:r>
+        <w:rPr>
+          <w:sz w:val="28"/>
+          <w:szCs w:val="28"/>
+        </w:rPr>
+        <w:t>Результат представлен на рисунке 2.6.</w:t>
+      </w:r>
+    </w:p>
+    <w:p>
+      <w:pPr>
+        <w:tabs>
+          <w:tab w:val="left" w:pos="426"/>
+        </w:tabs>
+        <w:jc w:val="center"/>
+        <w:rPr>
+          <w:sz w:val="28"/>
+          <w:szCs w:val="28"/>
+        </w:rPr>
+      </w:pPr>
+      <w:r>
+        <w:rPr>
+          <w:sz w:val="28"/>
+          <w:szCs w:val="28"/>
+        </w:rPr>
+        <w:lastRenderedPageBreak/>
+        <w:drawing>
+          <wp:inline distT="0" distB="0" distL="0" distR="0" wp14:anchorId="76169977" wp14:editId="53A820A0">
+            <wp:extent cx="6372225" cy="3091180"/>
+            <wp:effectExtent l="0" t="0" r="9525" b="0"/>
+            <wp:docPr id="21" name="Рисунок 21"/>
+            <wp:cNvGraphicFramePr>
+              <a:graphicFrameLocks xmlns:a="http://schemas.openxmlformats.org/drawingml/2006/main" noChangeAspect="1"/>
+            </wp:cNvGraphicFramePr>
+            <a:graphic xmlns:a="http://schemas.openxmlformats.org/drawingml/2006/main">
+              <a:graphicData uri="http://schemas.openxmlformats.org/drawingml/2006/picture">
+                <pic:pic xmlns:pic="http://schemas.openxmlformats.org/drawingml/2006/picture">
+                  <pic:nvPicPr>
+                    <pic:cNvPr id="1" name=""/>
+                    <pic:cNvPicPr/>
+                  </pic:nvPicPr>
+                  <pic:blipFill>
+                    <a:blip r:embed="rId25"/>
+                    <a:stretch>
+                      <a:fillRect/>
+                    </a:stretch>
+                  </pic:blipFill>
+                  <pic:spPr>
+                    <a:xfrm>
+                      <a:off x="0" y="0"/>
+                      <a:ext cx="6372225" cy="3091180"/>
+                    </a:xfrm>
+                    <a:prstGeom prst="rect">
+                      <a:avLst/>
+                    </a:prstGeom>
+                  </pic:spPr>
+                </pic:pic>
+              </a:graphicData>
+            </a:graphic>
+          </wp:inline>
+        </w:drawing>
+      </w:r>
+    </w:p>
+    <w:p>
+      <w:pPr>
+        <w:tabs>
+          <w:tab w:val="left" w:pos="426"/>
+        </w:tabs>
+        <w:jc w:val="center"/>
+        <w:rPr>
+          <w:sz w:val="28"/>
+          <w:szCs w:val="28"/>
+          <w:lang w:val="en-US"/>
+        </w:rPr>
+      </w:pPr>
+      <w:r>
+        <w:rPr>
+          <w:sz w:val="28"/>
+          <w:szCs w:val="28"/>
+        </w:rPr>
+        <w:t xml:space="preserve">Рисунок 2.6 – Результат редактирования файла </w:t>
+      </w:r>
+      <w:r>
+        <w:rPr>
+          <w:sz w:val="28"/>
+          <w:szCs w:val="28"/>
+          <w:lang w:val="en-US"/>
+        </w:rPr>
+        <w:t>models</w:t>
+      </w:r>
+      <w:r>
+        <w:rPr>
+          <w:sz w:val="28"/>
+          <w:szCs w:val="28"/>
+        </w:rPr>
+        <w:t>.</w:t>
+      </w:r>
+      <w:proofErr w:type="spellStart"/>
+      <w:r>
+        <w:rPr>
+          <w:sz w:val="28"/>
+          <w:szCs w:val="28"/>
+          <w:lang w:val="en-US"/>
+        </w:rPr>
+        <w:t>py</w:t>
+      </w:r>
+      <w:proofErr w:type="spellEnd"/>
+    </w:p>
+    <w:p>
+      <w:pPr>
+        <w:tabs>
+          <w:tab w:val="left" w:pos="426"/>
+        </w:tabs>
+        <w:spacing w:before="240"/>
+        <w:jc w:val="both"/>
+        <w:rPr>
+          <w:rStyle w:val="ac"/>
+          <w:rFonts w:ascii="Times New Roman" w:hAnsi="Times New Roman"/>
+          <w:b w:val="0"/>
+          <w:bCs/>
+          <w:szCs w:val="28"/>
+          <w:lang w:val="ru-RU"/>
+        </w:rPr>
+      </w:pPr>
+      <w:r>
+        <w:rPr>
+          <w:sz w:val="28"/>
+          <w:szCs w:val="28"/>
+        </w:rPr>
+        <w:tab/>
+      </w:r>
+      <w:r>
+        <w:rPr>
+          <w:sz w:val="28"/>
+          <w:szCs w:val="28"/>
+        </w:rPr>
+        <w:t>Далее для о</w:t>
+      </w:r>
+      <w:r>
+        <w:rPr>
+          <w:sz w:val="28"/>
+          <w:szCs w:val="28"/>
+        </w:rPr>
+        <w:t xml:space="preserve">беспечения возможности редактирования номера счёта на веб-страницах </w:t>
+      </w:r>
+      <w:proofErr w:type="spellStart"/>
+      <w:r>
+        <w:rPr>
+          <w:sz w:val="28"/>
+          <w:szCs w:val="28"/>
+          <w:lang w:val="en-US"/>
+        </w:rPr>
+        <w:t>odoo</w:t>
+      </w:r>
+      <w:proofErr w:type="spellEnd"/>
+      <w:r>
+        <w:rPr>
+          <w:sz w:val="28"/>
+          <w:szCs w:val="28"/>
+        </w:rPr>
+        <w:t xml:space="preserve"> </w:t>
+      </w:r>
+      <w:r>
+        <w:rPr>
+          <w:sz w:val="28"/>
+          <w:szCs w:val="28"/>
+        </w:rPr>
+        <w:t xml:space="preserve">вкладку с полем для ввода/вывода номера счета в существующее представление </w:t>
+      </w:r>
+      <w:proofErr w:type="spellStart"/>
+      <w:proofErr w:type="gramStart"/>
+      <w:r>
+        <w:rPr>
+          <w:rStyle w:val="ac"/>
+          <w:rFonts w:ascii="Times New Roman" w:hAnsi="Times New Roman"/>
+          <w:b w:val="0"/>
+          <w:bCs/>
+          <w:szCs w:val="28"/>
+        </w:rPr>
+        <w:t>hr</w:t>
+      </w:r>
+      <w:proofErr w:type="spellEnd"/>
+      <w:r>
+        <w:rPr>
+          <w:rStyle w:val="ac"/>
+          <w:rFonts w:ascii="Times New Roman" w:hAnsi="Times New Roman"/>
+          <w:b w:val="0"/>
+          <w:bCs/>
+          <w:szCs w:val="28"/>
+          <w:lang w:val="ru-RU"/>
+        </w:rPr>
+        <w:t>.</w:t>
+      </w:r>
+      <w:r>
+        <w:rPr>
+          <w:rStyle w:val="ac"/>
+          <w:rFonts w:ascii="Times New Roman" w:hAnsi="Times New Roman"/>
+          <w:b w:val="0"/>
+          <w:bCs/>
+          <w:szCs w:val="28"/>
+        </w:rPr>
+        <w:t>view</w:t>
+      </w:r>
+      <w:proofErr w:type="gramEnd"/>
+      <w:r>
+        <w:rPr>
+          <w:rStyle w:val="ac"/>
+          <w:rFonts w:ascii="Times New Roman" w:hAnsi="Times New Roman"/>
+          <w:b w:val="0"/>
+          <w:bCs/>
+          <w:szCs w:val="28"/>
+          <w:lang w:val="ru-RU"/>
+        </w:rPr>
+        <w:t>_</w:t>
+      </w:r>
+      <w:r>
+        <w:rPr>
+          <w:rStyle w:val="ac"/>
+          <w:rFonts w:ascii="Times New Roman" w:hAnsi="Times New Roman"/>
+          <w:b w:val="0"/>
+          <w:bCs/>
+          <w:szCs w:val="28"/>
+        </w:rPr>
+        <w:t>employee</w:t>
+      </w:r>
+      <w:r>
+        <w:rPr>
+          <w:rStyle w:val="ac"/>
+          <w:rFonts w:ascii="Times New Roman" w:hAnsi="Times New Roman"/>
+          <w:b w:val="0"/>
+          <w:bCs/>
+          <w:szCs w:val="28"/>
+          <w:lang w:val="ru-RU"/>
+        </w:rPr>
+        <w:t>_</w:t>
+      </w:r>
+      <w:r>
+        <w:rPr>
+          <w:rStyle w:val="ac"/>
+          <w:rFonts w:ascii="Times New Roman" w:hAnsi="Times New Roman"/>
+          <w:b w:val="0"/>
+          <w:bCs/>
+          <w:szCs w:val="28"/>
+        </w:rPr>
+        <w:t>form</w:t>
+      </w:r>
+      <w:r>
+        <w:rPr>
+          <w:rStyle w:val="ac"/>
+          <w:rFonts w:ascii="Times New Roman" w:hAnsi="Times New Roman"/>
+          <w:b w:val="0"/>
+          <w:bCs/>
+          <w:szCs w:val="28"/>
+          <w:lang w:val="ru-RU"/>
+        </w:rPr>
+        <w:t>.</w:t>
+      </w:r>
+      <w:r>
+        <w:rPr>
+          <w:rStyle w:val="ac"/>
+          <w:rFonts w:ascii="Times New Roman" w:hAnsi="Times New Roman"/>
+          <w:b w:val="0"/>
+          <w:bCs/>
+          <w:szCs w:val="28"/>
+          <w:lang w:val="ru-RU"/>
+        </w:rPr>
+        <w:t xml:space="preserve"> Результат редактирования представлен на рисунке 2.7.</w:t>
+      </w:r>
+    </w:p>
+    <w:p>
+      <w:pPr>
+        <w:tabs>
+          <w:tab w:val="left" w:pos="426"/>
+        </w:tabs>
+        <w:spacing w:before="240" w:after="120"/>
+        <w:jc w:val="center"/>
+        <w:rPr>
+          <w:bCs/>
+          <w:sz w:val="28"/>
+          <w:szCs w:val="28"/>
+        </w:rPr>
+      </w:pPr>
+      <w:r>
+        <w:rPr>
+          <w:bCs/>
+          <w:sz w:val="28"/>
+          <w:szCs w:val="28"/>
+        </w:rPr>
+        <w:drawing>
+          <wp:inline distT="0" distB="0" distL="0" distR="0" wp14:anchorId="0FD100F2" wp14:editId="429FFDE5">
+            <wp:extent cx="5364480" cy="3276957"/>
+            <wp:effectExtent l="0" t="0" r="7620" b="0"/>
+            <wp:docPr id="22" name="Рисунок 22"/>
+            <wp:cNvGraphicFramePr>
+              <a:graphicFrameLocks xmlns:a="http://schemas.openxmlformats.org/drawingml/2006/main" noChangeAspect="1"/>
+            </wp:cNvGraphicFramePr>
+            <a:graphic xmlns:a="http://schemas.openxmlformats.org/drawingml/2006/main">
+              <a:graphicData uri="http://schemas.openxmlformats.org/drawingml/2006/picture">
+                <pic:pic xmlns:pic="http://schemas.openxmlformats.org/drawingml/2006/picture">
+                  <pic:nvPicPr>
+                    <pic:cNvPr id="1" name=""/>
+                    <pic:cNvPicPr/>
+                  </pic:nvPicPr>
+                  <pic:blipFill>
+                    <a:blip r:embed="rId26"/>
+                    <a:stretch>
+                      <a:fillRect/>
+                    </a:stretch>
+                  </pic:blipFill>
+                  <pic:spPr>
+                    <a:xfrm>
+                      <a:off x="0" y="0"/>
+                      <a:ext cx="5369645" cy="3280112"/>
+                    </a:xfrm>
+                    <a:prstGeom prst="rect">
+                      <a:avLst/>
+                    </a:prstGeom>
+                  </pic:spPr>
+                </pic:pic>
+              </a:graphicData>
+            </a:graphic>
+          </wp:inline>
+        </w:drawing>
+      </w:r>
+    </w:p>
+    <w:p>
+      <w:pPr>
+        <w:tabs>
+          <w:tab w:val="left" w:pos="426"/>
+        </w:tabs>
+        <w:jc w:val="center"/>
+        <w:rPr>
+          <w:bCs/>
+          <w:sz w:val="28"/>
+          <w:szCs w:val="28"/>
+          <w:lang w:val="en-US"/>
+        </w:rPr>
+      </w:pPr>
+      <w:r>
+        <w:rPr>
+          <w:bCs/>
+          <w:sz w:val="28"/>
+          <w:szCs w:val="28"/>
+        </w:rPr>
+        <w:t xml:space="preserve">Рисунок 2.7 – Результат редактирования файла </w:t>
+      </w:r>
+      <w:r>
+        <w:rPr>
+          <w:bCs/>
+          <w:sz w:val="28"/>
+          <w:szCs w:val="28"/>
+          <w:lang w:val="en-US"/>
+        </w:rPr>
+        <w:t>views</w:t>
+      </w:r>
+      <w:r>
+        <w:rPr>
+          <w:bCs/>
+          <w:sz w:val="28"/>
+          <w:szCs w:val="28"/>
+        </w:rPr>
+        <w:t>.</w:t>
+      </w:r>
+      <w:r>
+        <w:rPr>
+          <w:bCs/>
+          <w:sz w:val="28"/>
+          <w:szCs w:val="28"/>
+          <w:lang w:val="en-US"/>
+        </w:rPr>
+        <w:t>xml</w:t>
+      </w:r>
+    </w:p>
+    <w:p>
+      <w:pPr>
+        <w:pStyle w:val="aa"/>
+        <w:tabs>
+          <w:tab w:val="left" w:pos="426"/>
+        </w:tabs>
+        <w:spacing w:before="240"/>
+        <w:ind w:left="0"/>
+        <w:rPr>
+          <w:szCs w:val="28"/>
+          <w:lang w:eastAsia="ru-RU"/>
+        </w:rPr>
+      </w:pPr>
+      <w:r>
+        <w:rPr>
+          <w:bCs/>
+          <w:szCs w:val="28"/>
+        </w:rPr>
+        <w:tab/>
+        <w:t xml:space="preserve">Так как </w:t>
+      </w:r>
+      <w:r>
+        <w:rPr>
+          <w:szCs w:val="28"/>
+          <w:lang w:eastAsia="ru-RU"/>
+        </w:rPr>
+        <w:t xml:space="preserve">наше расширяющее представление привязывается к модели из модуля </w:t>
+      </w:r>
+      <w:proofErr w:type="spellStart"/>
+      <w:r>
+        <w:rPr>
+          <w:rStyle w:val="ac"/>
+          <w:rFonts w:ascii="Times New Roman" w:hAnsi="Times New Roman"/>
+          <w:b w:val="0"/>
+          <w:bCs/>
+        </w:rPr>
+        <w:t>hr</w:t>
+      </w:r>
+      <w:proofErr w:type="spellEnd"/>
+      <w:r>
+        <w:rPr>
+          <w:szCs w:val="28"/>
+          <w:lang w:eastAsia="ru-RU"/>
+        </w:rPr>
+        <w:t xml:space="preserve">, </w:t>
+      </w:r>
+      <w:r>
+        <w:rPr>
+          <w:szCs w:val="28"/>
+          <w:lang w:eastAsia="ru-RU"/>
+        </w:rPr>
+        <w:t>укаж</w:t>
+      </w:r>
+      <w:r>
+        <w:rPr>
+          <w:szCs w:val="28"/>
+          <w:lang w:eastAsia="ru-RU"/>
+        </w:rPr>
+        <w:t>ем</w:t>
+      </w:r>
+      <w:r>
+        <w:rPr>
+          <w:szCs w:val="28"/>
+          <w:lang w:eastAsia="ru-RU"/>
+        </w:rPr>
+        <w:t xml:space="preserve"> данный модуль в списке зависимостей нашего модуля в файле </w:t>
+      </w:r>
+      <w:r>
+        <w:rPr>
+          <w:rStyle w:val="ac"/>
+          <w:rFonts w:ascii="Times New Roman" w:hAnsi="Times New Roman"/>
+          <w:b w:val="0"/>
+          <w:bCs/>
+          <w:lang w:val="ru-RU"/>
+        </w:rPr>
+        <w:t>__</w:t>
+      </w:r>
+      <w:r>
+        <w:rPr>
+          <w:rStyle w:val="ac"/>
+          <w:rFonts w:ascii="Times New Roman" w:hAnsi="Times New Roman"/>
+          <w:b w:val="0"/>
+          <w:bCs/>
+        </w:rPr>
+        <w:t>manifest</w:t>
+      </w:r>
+      <w:r>
+        <w:rPr>
+          <w:rStyle w:val="ac"/>
+          <w:rFonts w:ascii="Times New Roman" w:hAnsi="Times New Roman"/>
+          <w:b w:val="0"/>
+          <w:bCs/>
+          <w:lang w:val="ru-RU"/>
+        </w:rPr>
+        <w:t>__.</w:t>
+      </w:r>
+      <w:proofErr w:type="spellStart"/>
+      <w:r>
+        <w:rPr>
+          <w:rStyle w:val="ac"/>
+          <w:rFonts w:ascii="Times New Roman" w:hAnsi="Times New Roman"/>
+          <w:b w:val="0"/>
+          <w:bCs/>
+        </w:rPr>
+        <w:t>py</w:t>
+      </w:r>
+      <w:proofErr w:type="spellEnd"/>
+      <w:r>
+        <w:rPr>
+          <w:b/>
+          <w:bCs/>
+          <w:szCs w:val="28"/>
+          <w:lang w:eastAsia="ru-RU"/>
+        </w:rPr>
+        <w:t xml:space="preserve">. </w:t>
+      </w:r>
+      <w:r>
+        <w:rPr>
+          <w:szCs w:val="28"/>
+          <w:lang w:eastAsia="ru-RU"/>
+        </w:rPr>
+        <w:t>Результат редактирования представлен на рисунке 2.8.</w:t>
+      </w:r>
+    </w:p>
+    <w:p>
+      <w:pPr>
+        <w:pStyle w:val="aa"/>
+        <w:tabs>
+          <w:tab w:val="left" w:pos="426"/>
+        </w:tabs>
+        <w:spacing w:after="120"/>
+        <w:ind w:left="0"/>
+        <w:jc w:val="center"/>
+        <w:rPr>
+          <w:szCs w:val="28"/>
+          <w:lang w:eastAsia="ru-RU"/>
+        </w:rPr>
+      </w:pPr>
+      <w:r>
+        <w:rPr>
+          <w:szCs w:val="28"/>
+          <w:lang w:eastAsia="ru-RU"/>
+        </w:rPr>
+        <w:lastRenderedPageBreak/>
+        <w:drawing>
+          <wp:inline distT="0" distB="0" distL="0" distR="0" wp14:anchorId="2FC7A721" wp14:editId="19636380">
+            <wp:extent cx="5734850" cy="762106"/>
+            <wp:effectExtent l="0" t="0" r="0" b="0"/>
+            <wp:docPr id="23" name="Рисунок 23"/>
+            <wp:cNvGraphicFramePr>
+              <a:graphicFrameLocks xmlns:a="http://schemas.openxmlformats.org/drawingml/2006/main" noChangeAspect="1"/>
+            </wp:cNvGraphicFramePr>
+            <a:graphic xmlns:a="http://schemas.openxmlformats.org/drawingml/2006/main">
+              <a:graphicData uri="http://schemas.openxmlformats.org/drawingml/2006/picture">
+                <pic:pic xmlns:pic="http://schemas.openxmlformats.org/drawingml/2006/picture">
+                  <pic:nvPicPr>
+                    <pic:cNvPr id="1" name=""/>
+                    <pic:cNvPicPr/>
+                  </pic:nvPicPr>
+                  <pic:blipFill>
+                    <a:blip r:embed="rId27"/>
+                    <a:stretch>
+                      <a:fillRect/>
+                    </a:stretch>
+                  </pic:blipFill>
+                  <pic:spPr>
+                    <a:xfrm>
+                      <a:off x="0" y="0"/>
+                      <a:ext cx="5734850" cy="762106"/>
+                    </a:xfrm>
+                    <a:prstGeom prst="rect">
+                      <a:avLst/>
+                    </a:prstGeom>
+                  </pic:spPr>
+                </pic:pic>
+              </a:graphicData>
+            </a:graphic>
+          </wp:inline>
+        </w:drawing>
+      </w:r>
+    </w:p>
+    <w:p>
+      <w:pPr>
+        <w:pStyle w:val="aa"/>
+        <w:tabs>
+          <w:tab w:val="left" w:pos="426"/>
+        </w:tabs>
+        <w:spacing w:after="240"/>
+        <w:ind w:left="0"/>
+        <w:jc w:val="center"/>
+        <w:rPr>
+          <w:rStyle w:val="ac"/>
+          <w:rFonts w:ascii="Times New Roman" w:hAnsi="Times New Roman"/>
+          <w:b w:val="0"/>
+          <w:bCs/>
+        </w:rPr>
+      </w:pPr>
+      <w:r>
+        <w:rPr>
+          <w:szCs w:val="28"/>
+          <w:lang w:eastAsia="ru-RU"/>
+        </w:rPr>
+        <w:t xml:space="preserve">Рисунок 2.8 – Результат редактирования файла </w:t>
+      </w:r>
+      <w:r>
+        <w:rPr>
+          <w:rStyle w:val="ac"/>
+          <w:rFonts w:ascii="Times New Roman" w:hAnsi="Times New Roman"/>
+          <w:b w:val="0"/>
+          <w:bCs/>
+          <w:lang w:val="ru-RU"/>
+        </w:rPr>
+        <w:t>__</w:t>
+      </w:r>
+      <w:r>
+        <w:rPr>
+          <w:rStyle w:val="ac"/>
+          <w:rFonts w:ascii="Times New Roman" w:hAnsi="Times New Roman"/>
+          <w:b w:val="0"/>
+          <w:bCs/>
+        </w:rPr>
+        <w:t>manifest</w:t>
+      </w:r>
+      <w:r>
+        <w:rPr>
+          <w:rStyle w:val="ac"/>
+          <w:rFonts w:ascii="Times New Roman" w:hAnsi="Times New Roman"/>
+          <w:b w:val="0"/>
+          <w:bCs/>
+          <w:lang w:val="ru-RU"/>
+        </w:rPr>
+        <w:t>__.</w:t>
+      </w:r>
+      <w:proofErr w:type="spellStart"/>
+      <w:r>
+        <w:rPr>
+          <w:rStyle w:val="ac"/>
+          <w:rFonts w:ascii="Times New Roman" w:hAnsi="Times New Roman"/>
+          <w:b w:val="0"/>
+          <w:bCs/>
+        </w:rPr>
+        <w:t>py</w:t>
+      </w:r>
+      <w:proofErr w:type="spellEnd"/>
+    </w:p>
+    <w:p>
+      <w:pPr>
+        <w:pStyle w:val="aa"/>
+        <w:tabs>
+          <w:tab w:val="left" w:pos="426"/>
+        </w:tabs>
+        <w:spacing w:after="240"/>
+        <w:ind w:left="0"/>
+        <w:jc w:val="center"/>
+        <w:rPr>
+          <w:rStyle w:val="ac"/>
+          <w:rFonts w:ascii="Times New Roman" w:hAnsi="Times New Roman"/>
+          <w:b w:val="0"/>
+          <w:bCs/>
+        </w:rPr>
+      </w:pPr>
+    </w:p>
+    <w:p>
+      <w:pPr>
+        <w:pStyle w:val="aa"/>
+        <w:tabs>
+          <w:tab w:val="left" w:pos="426"/>
+        </w:tabs>
+        <w:ind w:left="0" w:firstLine="680"/>
+        <w:rPr>
+          <w:szCs w:val="28"/>
+          <w:lang w:eastAsia="ru-RU"/>
+        </w:rPr>
+      </w:pPr>
+      <w:r>
+        <w:rPr>
+          <w:szCs w:val="28"/>
+          <w:lang w:eastAsia="ru-RU"/>
+        </w:rPr>
+        <w:tab/>
+      </w:r>
+      <w:r>
+        <w:rPr>
+          <w:szCs w:val="28"/>
+          <w:lang w:eastAsia="ru-RU"/>
+        </w:rPr>
+        <w:t>Также для импорта в клиент-банк требуется генерировать простой текстовый файл, поэтому требуется использовать не представление, а контроллер</w:t>
+      </w:r>
+      <w:r>
+        <w:rPr>
+          <w:szCs w:val="28"/>
+          <w:lang w:eastAsia="ru-RU"/>
+        </w:rPr>
+        <w:t>. С</w:t>
+      </w:r>
+      <w:r>
+        <w:rPr>
+          <w:szCs w:val="28"/>
+          <w:lang w:eastAsia="ru-RU"/>
+        </w:rPr>
+        <w:t>озда</w:t>
+      </w:r>
+      <w:r>
+        <w:rPr>
+          <w:szCs w:val="28"/>
+          <w:lang w:eastAsia="ru-RU"/>
+        </w:rPr>
+        <w:t>дим</w:t>
+      </w:r>
+      <w:r>
+        <w:rPr>
+          <w:szCs w:val="28"/>
+          <w:lang w:eastAsia="ru-RU"/>
+        </w:rPr>
+        <w:t xml:space="preserve"> в файле </w:t>
+      </w:r>
+      <w:r>
+        <w:rPr>
+          <w:rStyle w:val="ac"/>
+          <w:rFonts w:ascii="Times New Roman" w:hAnsi="Times New Roman"/>
+          <w:b w:val="0"/>
+          <w:bCs/>
+          <w:lang w:val="ru-RU"/>
+        </w:rPr>
+        <w:t>/</w:t>
+      </w:r>
+      <w:r>
+        <w:rPr>
+          <w:rStyle w:val="ac"/>
+          <w:rFonts w:ascii="Times New Roman" w:hAnsi="Times New Roman"/>
+          <w:b w:val="0"/>
+          <w:bCs/>
+        </w:rPr>
+        <w:t>controllers</w:t>
+      </w:r>
+      <w:r>
+        <w:rPr>
+          <w:rStyle w:val="ac"/>
+          <w:rFonts w:ascii="Times New Roman" w:hAnsi="Times New Roman"/>
+          <w:b w:val="0"/>
+          <w:bCs/>
+          <w:lang w:val="ru-RU"/>
+        </w:rPr>
+        <w:t>/</w:t>
+      </w:r>
+      <w:r>
+        <w:rPr>
+          <w:rStyle w:val="ac"/>
+          <w:rFonts w:ascii="Times New Roman" w:hAnsi="Times New Roman"/>
+          <w:b w:val="0"/>
+          <w:bCs/>
+        </w:rPr>
+        <w:t>controllers</w:t>
+      </w:r>
+      <w:r>
+        <w:rPr>
+          <w:rStyle w:val="ac"/>
+          <w:rFonts w:ascii="Times New Roman" w:hAnsi="Times New Roman"/>
+          <w:b w:val="0"/>
+          <w:bCs/>
+          <w:lang w:val="ru-RU"/>
+        </w:rPr>
+        <w:t>.</w:t>
+      </w:r>
+      <w:proofErr w:type="spellStart"/>
+      <w:r>
+        <w:rPr>
+          <w:rStyle w:val="ac"/>
+          <w:rFonts w:ascii="Times New Roman" w:hAnsi="Times New Roman"/>
+          <w:b w:val="0"/>
+          <w:bCs/>
+        </w:rPr>
+        <w:t>py</w:t>
+      </w:r>
+      <w:proofErr w:type="spellEnd"/>
+      <w:r>
+        <w:rPr>
+          <w:szCs w:val="28"/>
+          <w:lang w:eastAsia="ru-RU"/>
+        </w:rPr>
+        <w:t xml:space="preserve"> контроллер с привязанным к определенному </w:t>
+      </w:r>
+      <w:r>
+        <w:rPr>
+          <w:szCs w:val="28"/>
+          <w:lang w:val="en-US" w:eastAsia="ru-RU"/>
+        </w:rPr>
+        <w:t>URL</w:t>
+      </w:r>
+      <w:r>
+        <w:rPr>
+          <w:szCs w:val="28"/>
+          <w:lang w:eastAsia="ru-RU"/>
+        </w:rPr>
+        <w:t xml:space="preserve"> </w:t>
+      </w:r>
+      <w:r>
+        <w:rPr>
+          <w:szCs w:val="28"/>
+          <w:lang w:eastAsia="ru-RU"/>
+        </w:rPr>
+        <w:t>методом</w:t>
+      </w:r>
+      <w:r>
+        <w:rPr>
+          <w:szCs w:val="28"/>
+          <w:lang w:eastAsia="ru-RU"/>
+        </w:rPr>
+        <w:t xml:space="preserve"> </w:t>
+      </w:r>
+      <w:r>
+        <w:rPr>
+          <w:rStyle w:val="ac"/>
+          <w:rFonts w:ascii="Times New Roman" w:hAnsi="Times New Roman"/>
+          <w:b w:val="0"/>
+          <w:bCs/>
+        </w:rPr>
+        <w:t>index</w:t>
+      </w:r>
+      <w:r>
+        <w:rPr>
+          <w:szCs w:val="28"/>
+          <w:lang w:eastAsia="ru-RU"/>
+        </w:rPr>
+        <w:t>, перебирающим всех работников, суммирующим для каждого работника оплату по всем действующим на текущую дату контрактам, формирующим файл из трех колонок</w:t>
+      </w:r>
+      <w:r>
+        <w:rPr>
+          <w:szCs w:val="28"/>
+          <w:lang w:eastAsia="ru-RU"/>
+        </w:rPr>
+        <w:t xml:space="preserve">, </w:t>
+      </w:r>
+      <w:r>
+        <w:rPr>
+          <w:szCs w:val="28"/>
+          <w:lang w:eastAsia="ru-RU"/>
+        </w:rPr>
+        <w:t>разделенных пробелами (</w:t>
+      </w:r>
+      <w:r>
+        <w:rPr>
+          <w:szCs w:val="28"/>
+          <w:lang w:val="en-US" w:eastAsia="ru-RU"/>
+        </w:rPr>
+        <w:t>IBAN</w:t>
+      </w:r>
+      <w:r>
+        <w:rPr>
+          <w:szCs w:val="28"/>
+          <w:lang w:eastAsia="ru-RU"/>
+        </w:rPr>
+        <w:t xml:space="preserve">, </w:t>
+      </w:r>
+      <w:r>
+        <w:rPr>
+          <w:szCs w:val="28"/>
+          <w:lang w:eastAsia="ru-RU"/>
+        </w:rPr>
+        <w:t xml:space="preserve">сумма выплат по контрактам, ФИО работника) и добавляющим перед файлом заголовок </w:t>
+      </w:r>
+      <w:r>
+        <w:rPr>
+          <w:szCs w:val="28"/>
+          <w:lang w:eastAsia="ru-RU"/>
+        </w:rPr>
+        <w:br/>
+      </w:r>
+      <w:r>
+        <w:rPr>
+          <w:rStyle w:val="ac"/>
+          <w:rFonts w:ascii="Times New Roman" w:hAnsi="Times New Roman"/>
+          <w:b w:val="0"/>
+          <w:bCs/>
+        </w:rPr>
+        <w:t>Content</w:t>
+      </w:r>
+      <w:r>
+        <w:rPr>
+          <w:rStyle w:val="ac"/>
+          <w:rFonts w:ascii="Times New Roman" w:hAnsi="Times New Roman"/>
+          <w:b w:val="0"/>
+          <w:bCs/>
+          <w:lang w:val="ru-RU"/>
+        </w:rPr>
+        <w:t>-</w:t>
+      </w:r>
+      <w:r>
+        <w:rPr>
+          <w:rStyle w:val="ac"/>
+          <w:rFonts w:ascii="Times New Roman" w:hAnsi="Times New Roman"/>
+          <w:b w:val="0"/>
+          <w:bCs/>
+        </w:rPr>
+        <w:t>Disposition</w:t>
+      </w:r>
+      <w:r>
+        <w:rPr>
+          <w:szCs w:val="28"/>
+          <w:lang w:eastAsia="ru-RU"/>
+        </w:rPr>
+        <w:t xml:space="preserve"> </w:t>
+      </w:r>
+      <w:r>
+        <w:rPr>
+          <w:szCs w:val="28"/>
+          <w:lang w:eastAsia="ru-RU"/>
+        </w:rPr>
+        <w:t>для загрузки этого файла, а не открытия в браузер</w:t>
+      </w:r>
+      <w:r>
+        <w:rPr>
+          <w:szCs w:val="28"/>
+          <w:lang w:eastAsia="ru-RU"/>
+        </w:rPr>
+        <w:t>е. Результат редактирования представлен на рисунке 2.9.</w:t>
+      </w:r>
+    </w:p>
+    <w:p>
+      <w:pPr>
+        <w:tabs>
+          <w:tab w:val="left" w:pos="426"/>
+        </w:tabs>
+        <w:spacing w:before="240" w:after="120"/>
+        <w:rPr>
+          <w:szCs w:val="28"/>
+        </w:rPr>
+      </w:pPr>
+      <w:r>
+        <w:rPr>
+          <w:szCs w:val="28"/>
+        </w:rPr>
+        <w:drawing>
+          <wp:inline distT="0" distB="0" distL="0" distR="0" wp14:anchorId="2EBAD50C" wp14:editId="6D1F6A45">
+            <wp:extent cx="6372225" cy="4251960"/>
+            <wp:effectExtent l="0" t="0" r="9525" b="0"/>
+            <wp:docPr id="24" name="Рисунок 24"/>
+            <wp:cNvGraphicFramePr>
+              <a:graphicFrameLocks xmlns:a="http://schemas.openxmlformats.org/drawingml/2006/main" noChangeAspect="1"/>
+            </wp:cNvGraphicFramePr>
+            <a:graphic xmlns:a="http://schemas.openxmlformats.org/drawingml/2006/main">
+              <a:graphicData uri="http://schemas.openxmlformats.org/drawingml/2006/picture">
+                <pic:pic xmlns:pic="http://schemas.openxmlformats.org/drawingml/2006/picture">
+                  <pic:nvPicPr>
+                    <pic:cNvPr id="1" name=""/>
+                    <pic:cNvPicPr/>
+                  </pic:nvPicPr>
+                  <pic:blipFill>
+                    <a:blip r:embed="rId28"/>
+                    <a:stretch>
+                      <a:fillRect/>
+                    </a:stretch>
+                  </pic:blipFill>
+                  <pic:spPr>
+                    <a:xfrm>
+                      <a:off x="0" y="0"/>
+                      <a:ext cx="6372225" cy="4251960"/>
+                    </a:xfrm>
+                    <a:prstGeom prst="rect">
+                      <a:avLst/>
+                    </a:prstGeom>
+                  </pic:spPr>
+                </pic:pic>
+              </a:graphicData>
+            </a:graphic>
+          </wp:inline>
+        </w:drawing>
+      </w:r>
+    </w:p>
+    <w:p>
+      <w:pPr>
+        <w:tabs>
+          <w:tab w:val="left" w:pos="426"/>
+        </w:tabs>
+        <w:jc w:val="center"/>
+        <w:rPr>
+          <w:sz w:val="28"/>
+          <w:szCs w:val="28"/>
+        </w:rPr>
+      </w:pPr>
+      <w:r>
+        <w:rPr>
+          <w:sz w:val="28"/>
+          <w:szCs w:val="28"/>
+        </w:rPr>
+        <w:t xml:space="preserve">Рисунок 2.9 – Результат редактирования файла </w:t>
+      </w:r>
+      <w:r>
+        <w:rPr>
+          <w:sz w:val="28"/>
+          <w:szCs w:val="28"/>
+          <w:lang w:val="en-US"/>
+        </w:rPr>
+        <w:t>controllers</w:t>
+      </w:r>
+      <w:r>
+        <w:rPr>
+          <w:sz w:val="28"/>
+          <w:szCs w:val="28"/>
+        </w:rPr>
+        <w:t>.</w:t>
+      </w:r>
+      <w:proofErr w:type="spellStart"/>
+      <w:r>
+        <w:rPr>
+          <w:sz w:val="28"/>
+          <w:szCs w:val="28"/>
+          <w:lang w:val="en-US"/>
+        </w:rPr>
+        <w:t>py</w:t>
+      </w:r>
+      <w:proofErr w:type="spellEnd"/>
+    </w:p>
+    <w:p>
+      <w:pPr>
+        <w:pStyle w:val="aa"/>
+        <w:tabs>
+          <w:tab w:val="left" w:pos="426"/>
+        </w:tabs>
+        <w:spacing w:after="240"/>
+        <w:ind w:left="0"/>
+        <w:rPr>
+          <w:bCs/>
         </w:rPr>
       </w:pPr>
     </w:p>
@@ -1762,6 +5130,103 @@
     </w:p>
   </w:footnote>
 </w:footnotes>
+</file>
+
+<file path=word/numbering.xml><?xml version="1.0" encoding="utf-8"?>
+<w:numbering xmlns:wpc="http://schemas.microsoft.com/office/word/2010/wordprocessingCanvas" xmlns:cx="http://schemas.microsoft.com/office/drawing/2014/chartex" xmlns:cx1="http://schemas.microsoft.com/office/drawing/2015/9/8/chartex" xmlns:cx2="http://schemas.microsoft.com/office/drawing/2015/10/21/chartex" xmlns:cx3="http://schemas.microsoft.com/office/drawing/2016/5/9/chartex" xmlns:cx4="http://schemas.microsoft.com/office/drawing/2016/5/10/chartex" xmlns:cx5="http://schemas.microsoft.com/office/drawing/2016/5/11/chartex" xmlns:cx6="http://schemas.microsoft.com/office/drawing/2016/5/12/chartex" xmlns:cx7="http://schemas.microsoft.com/office/drawing/2016/5/13/chartex" xmlns:cx8="http://schemas.microsoft.com/office/drawing/2016/5/14/chartex" xmlns:mc="http://schemas.openxmlformats.org/markup-compatibility/2006" xmlns:aink="http://schemas.microsoft.com/office/drawing/2016/ink" xmlns:am3d="http://schemas.microsoft.com/office/drawing/2017/model3d" xmlns:o="urn:schemas-microsoft-com:office:office" xmlns:r="http://schemas.openxmlformats.org/officeDocument/2006/relationships" xmlns:m="http://schemas.openxmlformats.org/officeDocument/2006/math" xmlns:v="urn:schemas-microsoft-com:vml" xmlns:wp14="http://schemas.microsoft.com/office/word/2010/wordprocessingDrawing" xmlns:wp="http://schemas.openxmlformats.org/drawingml/2006/wordprocessingDrawing" xmlns:w10="urn:schemas-microsoft-com:office:word" xmlns:w="http://schemas.openxmlformats.org/wordprocessingml/2006/main" xmlns:w14="http://schemas.microsoft.com/office/word/2010/wordml" xmlns:w15="http://schemas.microsoft.com/office/word/2012/wordml" xmlns:w16cex="http://schemas.microsoft.com/office/word/2018/wordml/cex" xmlns:w16cid="http://schemas.microsoft.com/office/word/2016/wordml/cid" xmlns:w16="http://schemas.microsoft.com/office/word/2018/wordml" xmlns:w16sdtdh="http://schemas.microsoft.com/office/word/2020/wordml/sdtdatahash" xmlns:w16se="http://schemas.microsoft.com/office/word/2015/wordml/symex" xmlns:wpg="http://schemas.microsoft.com/office/word/2010/wordprocessingGroup" xmlns:wpi="http://schemas.microsoft.com/office/word/2010/wordprocessingInk" xmlns:wne="http://schemas.microsoft.com/office/word/2006/wordml" xmlns:wps="http://schemas.microsoft.com/office/word/2010/wordprocessingShape" mc:Ignorable="w14 w15 w16se w16cid w16 w16cex w16sdtdh wp14">
+  <w:abstractNum w:abstractNumId="0" w15:restartNumberingAfterBreak="0">
+    <w:nsid w:val="51FC6706"/>
+    <w:multiLevelType w:val="hybridMultilevel"/>
+    <w:tmpl w:val="2B12D616"/>
+    <w:lvl w:ilvl="0" w:tplc="8B162DBC">
+      <w:start w:val="1"/>
+      <w:numFmt w:val="decimal"/>
+      <w:lvlText w:val="%1."/>
+      <w:lvlJc w:val="left"/>
+      <w:pPr>
+        <w:ind w:left="720" w:hanging="360"/>
+      </w:pPr>
+      <w:rPr>
+        <w:b w:val="0"/>
+      </w:rPr>
+    </w:lvl>
+    <w:lvl w:ilvl="1" w:tplc="04190019" w:tentative="1">
+      <w:start w:val="1"/>
+      <w:numFmt w:val="lowerLetter"/>
+      <w:lvlText w:val="%2."/>
+      <w:lvlJc w:val="left"/>
+      <w:pPr>
+        <w:ind w:left="1440" w:hanging="360"/>
+      </w:pPr>
+    </w:lvl>
+    <w:lvl w:ilvl="2" w:tplc="0419001B" w:tentative="1">
+      <w:start w:val="1"/>
+      <w:numFmt w:val="lowerRoman"/>
+      <w:lvlText w:val="%3."/>
+      <w:lvlJc w:val="right"/>
+      <w:pPr>
+        <w:ind w:left="2160" w:hanging="180"/>
+      </w:pPr>
+    </w:lvl>
+    <w:lvl w:ilvl="3" w:tplc="0419000F" w:tentative="1">
+      <w:start w:val="1"/>
+      <w:numFmt w:val="decimal"/>
+      <w:lvlText w:val="%4."/>
+      <w:lvlJc w:val="left"/>
+      <w:pPr>
+        <w:ind w:left="2880" w:hanging="360"/>
+      </w:pPr>
+    </w:lvl>
+    <w:lvl w:ilvl="4" w:tplc="04190019" w:tentative="1">
+      <w:start w:val="1"/>
+      <w:numFmt w:val="lowerLetter"/>
+      <w:lvlText w:val="%5."/>
+      <w:lvlJc w:val="left"/>
+      <w:pPr>
+        <w:ind w:left="3600" w:hanging="360"/>
+      </w:pPr>
+    </w:lvl>
+    <w:lvl w:ilvl="5" w:tplc="0419001B" w:tentative="1">
+      <w:start w:val="1"/>
+      <w:numFmt w:val="lowerRoman"/>
+      <w:lvlText w:val="%6."/>
+      <w:lvlJc w:val="right"/>
+      <w:pPr>
+        <w:ind w:left="4320" w:hanging="180"/>
+      </w:pPr>
+    </w:lvl>
+    <w:lvl w:ilvl="6" w:tplc="0419000F" w:tentative="1">
+      <w:start w:val="1"/>
+      <w:numFmt w:val="decimal"/>
+      <w:lvlText w:val="%7."/>
+      <w:lvlJc w:val="left"/>
+      <w:pPr>
+        <w:ind w:left="5040" w:hanging="360"/>
+      </w:pPr>
+    </w:lvl>
+    <w:lvl w:ilvl="7" w:tplc="04190019" w:tentative="1">
+      <w:start w:val="1"/>
+      <w:numFmt w:val="lowerLetter"/>
+      <w:lvlText w:val="%8."/>
+      <w:lvlJc w:val="left"/>
+      <w:pPr>
+        <w:ind w:left="5760" w:hanging="360"/>
+      </w:pPr>
+    </w:lvl>
+    <w:lvl w:ilvl="8" w:tplc="0419001B" w:tentative="1">
+      <w:start w:val="1"/>
+      <w:numFmt w:val="lowerRoman"/>
+      <w:lvlText w:val="%9."/>
+      <w:lvlJc w:val="right"/>
+      <w:pPr>
+        <w:ind w:left="6480" w:hanging="180"/>
+      </w:pPr>
+    </w:lvl>
+  </w:abstractNum>
+  <w:num w:numId="1">
+    <w:abstractNumId w:val="0"/>
+  </w:num>
+</w:numbering>
 </file>
 
 <file path=word/styles.xml><?xml version="1.0" encoding="utf-8"?>
@@ -2326,6 +5791,52 @@
       <w:bCs/>
     </w:rPr>
   </w:style>
+  <w:style w:type="paragraph" w:styleId="aa">
+    <w:name w:val="List Paragraph"/>
+    <w:basedOn w:val="a"/>
+    <w:uiPriority w:val="34"/>
+    <w:qFormat/>
+    <w:rsid w:val="00E82EE7"/>
+    <w:pPr>
+      <w:ind w:left="720"/>
+      <w:contextualSpacing/>
+      <w:jc w:val="both"/>
+    </w:pPr>
+    <w:rPr>
+      <w:sz w:val="28"/>
+      <w:szCs w:val="22"/>
+      <w:lang w:eastAsia="en-US"/>
+    </w:rPr>
+  </w:style>
+  <w:style w:type="paragraph" w:customStyle="1" w:styleId="ab">
+    <w:name w:val="Код"/>
+    <w:basedOn w:val="a"/>
+    <w:link w:val="ac"/>
+    <w:qFormat/>
+    <w:rsid w:val="00536DCE"/>
+    <w:pPr>
+      <w:jc w:val="both"/>
+    </w:pPr>
+    <w:rPr>
+      <w:rFonts w:ascii="Courier New" w:hAnsi="Courier New"/>
+      <w:b/>
+      <w:sz w:val="28"/>
+      <w:szCs w:val="22"/>
+      <w:lang w:val="en-US" w:eastAsia="en-US"/>
+    </w:rPr>
+  </w:style>
+  <w:style w:type="character" w:customStyle="1" w:styleId="ac">
+    <w:name w:val="Код Знак"/>
+    <w:basedOn w:val="a0"/>
+    <w:link w:val="ab"/>
+    <w:rsid w:val="00536DCE"/>
+    <w:rPr>
+      <w:rFonts w:ascii="Courier New" w:eastAsia="Times New Roman" w:hAnsi="Courier New" w:cs="Times New Roman"/>
+      <w:b/>
+      <w:sz w:val="28"/>
+      <w:lang w:val="en-US"/>
+    </w:rPr>
+  </w:style>
 </w:styles>
 </file>
 

</xml_diff>